<commit_message>
Add top-10 confirmed/not-found tables to 1.3.4 Harvest FW27 detail
Named-franchise visibility for the two decision-relevant buckets: top 10
by 2025 sales of the 33 confirmed-continuing franchises, and top 10 of
the 159 not-found-anywhere franchises. Full 236-franchise detail (all
four statuses) is in the backup workbook; the 44 possible-match
franchises needing Product/Merchandising review are in the separate
review spreadsheet.

Co-Authored-By: Claude Sonnet 5 <noreply@anthropic.com>
Claude-Session: https://claude.ai/code/session_018rY4Yk5PcMJiv8P66rrhuy
</commit_message>
<xml_diff>
--- a/workshop_prep/Project_Bob_Workshop_PreRead_Brief_Sec3_Draft_v2.docx
+++ b/workshop_prep/Project_Bob_Workshop_PreRead_Brief_Sec3_Draft_v2.docx
@@ -27530,6 +27530,3157 @@
         </w:tc>
       </w:tr>
     </w:tbl>
+    <w:p>
+      <w:pPr>
+        <w:spacing w:after="160"/>
+      </w:pPr>
+      <w:r>
+        <w:t xml:space="preserve">Top 10 of the 33 confirmed-continuing franchises, by 2025 sales:</w:t>
+      </w:r>
+    </w:p>
+    <w:tbl>
+      <w:tblPr>
+        <w:tblW w:type="dxa" w:w="9350"/>
+        <w:tblBorders>
+          <w:top w:val="single" w:color="auto" w:sz="4"/>
+          <w:left w:val="single" w:color="auto" w:sz="4"/>
+          <w:bottom w:val="single" w:color="auto" w:sz="4"/>
+          <w:right w:val="single" w:color="auto" w:sz="4"/>
+          <w:insideH w:val="single" w:color="auto" w:sz="4"/>
+          <w:insideV w:val="single" w:color="auto" w:sz="4"/>
+        </w:tblBorders>
+      </w:tblPr>
+      <w:tblGrid>
+        <w:gridCol w:w="2900"/>
+        <w:gridCol w:w="1600"/>
+        <w:gridCol w:w="1350"/>
+        <w:gridCol w:w="1250"/>
+        <w:gridCol w:w="1250"/>
+      </w:tblGrid>
+      <w:tr>
+        <w:trPr>
+          <w:tblHeader/>
+        </w:trPr>
+        <w:tc>
+          <w:tcPr>
+            <w:tcW w:type="dxa" w:w="2900"/>
+            <w:shd w:fill="2F2F2F" w:val="clear"/>
+            <w:tcMar>
+              <w:top w:type="dxa" w:w="60"/>
+              <w:left w:type="dxa" w:w="100"/>
+              <w:bottom w:type="dxa" w:w="60"/>
+              <w:right w:type="dxa" w:w="100"/>
+            </w:tcMar>
+            <w:vAlign w:val="center"/>
+          </w:tcPr>
+          <w:p>
+            <w:pPr>
+              <w:jc w:val="left"/>
+            </w:pPr>
+            <w:r>
+              <w:rPr>
+                <w:b/>
+                <w:bCs/>
+                <w:color w:val="FFFFFF"/>
+                <w:sz w:val="18"/>
+                <w:szCs w:val="18"/>
+              </w:rPr>
+              <w:t xml:space="preserve">Franchise</w:t>
+            </w:r>
+          </w:p>
+        </w:tc>
+        <w:tc>
+          <w:tcPr>
+            <w:tcW w:type="dxa" w:w="1600"/>
+            <w:shd w:fill="2F2F2F" w:val="clear"/>
+            <w:tcMar>
+              <w:top w:type="dxa" w:w="60"/>
+              <w:left w:type="dxa" w:w="100"/>
+              <w:bottom w:type="dxa" w:w="60"/>
+              <w:right w:type="dxa" w:w="100"/>
+            </w:tcMar>
+            <w:vAlign w:val="center"/>
+          </w:tcPr>
+          <w:p>
+            <w:pPr>
+              <w:jc w:val="center"/>
+            </w:pPr>
+            <w:r>
+              <w:rPr>
+                <w:b/>
+                <w:bCs/>
+                <w:color w:val="FFFFFF"/>
+                <w:sz w:val="18"/>
+                <w:szCs w:val="18"/>
+              </w:rPr>
+              <w:t xml:space="preserve">Layer</w:t>
+            </w:r>
+          </w:p>
+        </w:tc>
+        <w:tc>
+          <w:tcPr>
+            <w:tcW w:type="dxa" w:w="1350"/>
+            <w:shd w:fill="2F2F2F" w:val="clear"/>
+            <w:tcMar>
+              <w:top w:type="dxa" w:w="60"/>
+              <w:left w:type="dxa" w:w="100"/>
+              <w:bottom w:type="dxa" w:w="60"/>
+              <w:right w:type="dxa" w:w="100"/>
+            </w:tcMar>
+            <w:vAlign w:val="center"/>
+          </w:tcPr>
+          <w:p>
+            <w:pPr>
+              <w:jc w:val="center"/>
+            </w:pPr>
+            <w:r>
+              <w:rPr>
+                <w:b/>
+                <w:bCs/>
+                <w:color w:val="FFFFFF"/>
+                <w:sz w:val="18"/>
+                <w:szCs w:val="18"/>
+              </w:rPr>
+              <w:t xml:space="preserve">Sales 2025</w:t>
+            </w:r>
+          </w:p>
+        </w:tc>
+        <w:tc>
+          <w:tcPr>
+            <w:tcW w:type="dxa" w:w="1250"/>
+            <w:shd w:fill="2F2F2F" w:val="clear"/>
+            <w:tcMar>
+              <w:top w:type="dxa" w:w="60"/>
+              <w:left w:type="dxa" w:w="100"/>
+              <w:bottom w:type="dxa" w:w="60"/>
+              <w:right w:type="dxa" w:w="100"/>
+            </w:tcMar>
+            <w:vAlign w:val="center"/>
+          </w:tcPr>
+          <w:p>
+            <w:pPr>
+              <w:jc w:val="center"/>
+            </w:pPr>
+            <w:r>
+              <w:rPr>
+                <w:b/>
+                <w:bCs/>
+                <w:color w:val="FFFFFF"/>
+                <w:sz w:val="18"/>
+                <w:szCs w:val="18"/>
+              </w:rPr>
+              <w:t xml:space="preserve">Growth %</w:t>
+            </w:r>
+          </w:p>
+        </w:tc>
+        <w:tc>
+          <w:tcPr>
+            <w:tcW w:type="dxa" w:w="1250"/>
+            <w:shd w:fill="2F2F2F" w:val="clear"/>
+            <w:tcMar>
+              <w:top w:type="dxa" w:w="60"/>
+              <w:left w:type="dxa" w:w="100"/>
+              <w:bottom w:type="dxa" w:w="60"/>
+              <w:right w:type="dxa" w:w="100"/>
+            </w:tcMar>
+            <w:vAlign w:val="center"/>
+          </w:tcPr>
+          <w:p>
+            <w:pPr>
+              <w:jc w:val="center"/>
+            </w:pPr>
+            <w:r>
+              <w:rPr>
+                <w:b/>
+                <w:bCs/>
+                <w:color w:val="FFFFFF"/>
+                <w:sz w:val="18"/>
+                <w:szCs w:val="18"/>
+              </w:rPr>
+              <w:t xml:space="preserve">GM% 2025</w:t>
+            </w:r>
+          </w:p>
+        </w:tc>
+      </w:tr>
+      <w:tr>
+        <w:tc>
+          <w:tcPr>
+            <w:tcW w:type="dxa" w:w="2900"/>
+            <w:tcMar>
+              <w:top w:type="dxa" w:w="60"/>
+              <w:left w:type="dxa" w:w="100"/>
+              <w:bottom w:type="dxa" w:w="60"/>
+              <w:right w:type="dxa" w:w="100"/>
+            </w:tcMar>
+            <w:vAlign w:val="center"/>
+          </w:tcPr>
+          <w:p>
+            <w:pPr>
+              <w:jc w:val="left"/>
+            </w:pPr>
+            <w:r>
+              <w:rPr>
+                <w:b w:val="false"/>
+                <w:bCs w:val="false"/>
+                <w:color w:val="000000"/>
+                <w:sz w:val="18"/>
+                <w:szCs w:val="18"/>
+              </w:rPr>
+              <w:t xml:space="preserve">L.I.M GTX Jacket (Men)</w:t>
+            </w:r>
+          </w:p>
+        </w:tc>
+        <w:tc>
+          <w:tcPr>
+            <w:tcW w:type="dxa" w:w="1600"/>
+            <w:tcMar>
+              <w:top w:type="dxa" w:w="60"/>
+              <w:left w:type="dxa" w:w="100"/>
+              <w:bottom w:type="dxa" w:w="60"/>
+              <w:right w:type="dxa" w:w="100"/>
+            </w:tcMar>
+            <w:vAlign w:val="center"/>
+          </w:tcPr>
+          <w:p>
+            <w:pPr>
+              <w:jc w:val="center"/>
+            </w:pPr>
+            <w:r>
+              <w:rPr>
+                <w:b w:val="false"/>
+                <w:bCs w:val="false"/>
+                <w:color w:val="000000"/>
+                <w:sz w:val="18"/>
+                <w:szCs w:val="18"/>
+              </w:rPr>
+              <w:t xml:space="preserve">Shell</w:t>
+            </w:r>
+          </w:p>
+        </w:tc>
+        <w:tc>
+          <w:tcPr>
+            <w:tcW w:type="dxa" w:w="1350"/>
+            <w:tcMar>
+              <w:top w:type="dxa" w:w="60"/>
+              <w:left w:type="dxa" w:w="100"/>
+              <w:bottom w:type="dxa" w:w="60"/>
+              <w:right w:type="dxa" w:w="100"/>
+            </w:tcMar>
+            <w:vAlign w:val="center"/>
+          </w:tcPr>
+          <w:p>
+            <w:pPr>
+              <w:jc w:val="center"/>
+            </w:pPr>
+            <w:r>
+              <w:rPr>
+                <w:b w:val="false"/>
+                <w:bCs w:val="false"/>
+                <w:color w:val="000000"/>
+                <w:sz w:val="18"/>
+                <w:szCs w:val="18"/>
+              </w:rPr>
+              <w:t xml:space="preserve">8.81M</w:t>
+            </w:r>
+          </w:p>
+        </w:tc>
+        <w:tc>
+          <w:tcPr>
+            <w:tcW w:type="dxa" w:w="1250"/>
+            <w:tcMar>
+              <w:top w:type="dxa" w:w="60"/>
+              <w:left w:type="dxa" w:w="100"/>
+              <w:bottom w:type="dxa" w:w="60"/>
+              <w:right w:type="dxa" w:w="100"/>
+            </w:tcMar>
+            <w:vAlign w:val="center"/>
+          </w:tcPr>
+          <w:p>
+            <w:pPr>
+              <w:jc w:val="center"/>
+            </w:pPr>
+            <w:r>
+              <w:rPr>
+                <w:b w:val="false"/>
+                <w:bCs w:val="false"/>
+                <w:color w:val="000000"/>
+                <w:sz w:val="18"/>
+                <w:szCs w:val="18"/>
+              </w:rPr>
+              <w:t xml:space="preserve">-35.9%</w:t>
+            </w:r>
+          </w:p>
+        </w:tc>
+        <w:tc>
+          <w:tcPr>
+            <w:tcW w:type="dxa" w:w="1250"/>
+            <w:tcMar>
+              <w:top w:type="dxa" w:w="60"/>
+              <w:left w:type="dxa" w:w="100"/>
+              <w:bottom w:type="dxa" w:w="60"/>
+              <w:right w:type="dxa" w:w="100"/>
+            </w:tcMar>
+            <w:vAlign w:val="center"/>
+          </w:tcPr>
+          <w:p>
+            <w:pPr>
+              <w:jc w:val="center"/>
+            </w:pPr>
+            <w:r>
+              <w:rPr>
+                <w:b w:val="false"/>
+                <w:bCs w:val="false"/>
+                <w:color w:val="000000"/>
+                <w:sz w:val="18"/>
+                <w:szCs w:val="18"/>
+              </w:rPr>
+              <w:t xml:space="preserve">49.1%</w:t>
+            </w:r>
+          </w:p>
+        </w:tc>
+      </w:tr>
+      <w:tr>
+        <w:tc>
+          <w:tcPr>
+            <w:tcW w:type="dxa" w:w="2900"/>
+            <w:shd w:fill="F5F5F5" w:val="clear"/>
+            <w:tcMar>
+              <w:top w:type="dxa" w:w="60"/>
+              <w:left w:type="dxa" w:w="100"/>
+              <w:bottom w:type="dxa" w:w="60"/>
+              <w:right w:type="dxa" w:w="100"/>
+            </w:tcMar>
+            <w:vAlign w:val="center"/>
+          </w:tcPr>
+          <w:p>
+            <w:pPr>
+              <w:jc w:val="left"/>
+            </w:pPr>
+            <w:r>
+              <w:rPr>
+                <w:b w:val="false"/>
+                <w:bCs w:val="false"/>
+                <w:color w:val="000000"/>
+                <w:sz w:val="18"/>
+                <w:szCs w:val="18"/>
+              </w:rPr>
+              <w:t xml:space="preserve">L.I.M GTX Jacket (Women)</w:t>
+            </w:r>
+          </w:p>
+        </w:tc>
+        <w:tc>
+          <w:tcPr>
+            <w:tcW w:type="dxa" w:w="1600"/>
+            <w:shd w:fill="F5F5F5" w:val="clear"/>
+            <w:tcMar>
+              <w:top w:type="dxa" w:w="60"/>
+              <w:left w:type="dxa" w:w="100"/>
+              <w:bottom w:type="dxa" w:w="60"/>
+              <w:right w:type="dxa" w:w="100"/>
+            </w:tcMar>
+            <w:vAlign w:val="center"/>
+          </w:tcPr>
+          <w:p>
+            <w:pPr>
+              <w:jc w:val="center"/>
+            </w:pPr>
+            <w:r>
+              <w:rPr>
+                <w:b w:val="false"/>
+                <w:bCs w:val="false"/>
+                <w:color w:val="000000"/>
+                <w:sz w:val="18"/>
+                <w:szCs w:val="18"/>
+              </w:rPr>
+              <w:t xml:space="preserve">Shell</w:t>
+            </w:r>
+          </w:p>
+        </w:tc>
+        <w:tc>
+          <w:tcPr>
+            <w:tcW w:type="dxa" w:w="1350"/>
+            <w:shd w:fill="F5F5F5" w:val="clear"/>
+            <w:tcMar>
+              <w:top w:type="dxa" w:w="60"/>
+              <w:left w:type="dxa" w:w="100"/>
+              <w:bottom w:type="dxa" w:w="60"/>
+              <w:right w:type="dxa" w:w="100"/>
+            </w:tcMar>
+            <w:vAlign w:val="center"/>
+          </w:tcPr>
+          <w:p>
+            <w:pPr>
+              <w:jc w:val="center"/>
+            </w:pPr>
+            <w:r>
+              <w:rPr>
+                <w:b w:val="false"/>
+                <w:bCs w:val="false"/>
+                <w:color w:val="000000"/>
+                <w:sz w:val="18"/>
+                <w:szCs w:val="18"/>
+              </w:rPr>
+              <w:t xml:space="preserve">4.52M</w:t>
+            </w:r>
+          </w:p>
+        </w:tc>
+        <w:tc>
+          <w:tcPr>
+            <w:tcW w:type="dxa" w:w="1250"/>
+            <w:shd w:fill="F5F5F5" w:val="clear"/>
+            <w:tcMar>
+              <w:top w:type="dxa" w:w="60"/>
+              <w:left w:type="dxa" w:w="100"/>
+              <w:bottom w:type="dxa" w:w="60"/>
+              <w:right w:type="dxa" w:w="100"/>
+            </w:tcMar>
+            <w:vAlign w:val="center"/>
+          </w:tcPr>
+          <w:p>
+            <w:pPr>
+              <w:jc w:val="center"/>
+            </w:pPr>
+            <w:r>
+              <w:rPr>
+                <w:b w:val="false"/>
+                <w:bCs w:val="false"/>
+                <w:color w:val="000000"/>
+                <w:sz w:val="18"/>
+                <w:szCs w:val="18"/>
+              </w:rPr>
+              <w:t xml:space="preserve">-59.2%</w:t>
+            </w:r>
+          </w:p>
+        </w:tc>
+        <w:tc>
+          <w:tcPr>
+            <w:tcW w:type="dxa" w:w="1250"/>
+            <w:shd w:fill="F5F5F5" w:val="clear"/>
+            <w:tcMar>
+              <w:top w:type="dxa" w:w="60"/>
+              <w:left w:type="dxa" w:w="100"/>
+              <w:bottom w:type="dxa" w:w="60"/>
+              <w:right w:type="dxa" w:w="100"/>
+            </w:tcMar>
+            <w:vAlign w:val="center"/>
+          </w:tcPr>
+          <w:p>
+            <w:pPr>
+              <w:jc w:val="center"/>
+            </w:pPr>
+            <w:r>
+              <w:rPr>
+                <w:b w:val="false"/>
+                <w:bCs w:val="false"/>
+                <w:color w:val="000000"/>
+                <w:sz w:val="18"/>
+                <w:szCs w:val="18"/>
+              </w:rPr>
+              <w:t xml:space="preserve">49.4%</w:t>
+            </w:r>
+          </w:p>
+        </w:tc>
+      </w:tr>
+      <w:tr>
+        <w:tc>
+          <w:tcPr>
+            <w:tcW w:type="dxa" w:w="2900"/>
+            <w:tcMar>
+              <w:top w:type="dxa" w:w="60"/>
+              <w:left w:type="dxa" w:w="100"/>
+              <w:bottom w:type="dxa" w:w="60"/>
+              <w:right w:type="dxa" w:w="100"/>
+            </w:tcMar>
+            <w:vAlign w:val="center"/>
+          </w:tcPr>
+          <w:p>
+            <w:pPr>
+              <w:jc w:val="left"/>
+            </w:pPr>
+            <w:r>
+              <w:rPr>
+                <w:b w:val="false"/>
+                <w:bCs w:val="false"/>
+                <w:color w:val="000000"/>
+                <w:sz w:val="18"/>
+                <w:szCs w:val="18"/>
+              </w:rPr>
+              <w:t xml:space="preserve">Mid Standard Pant (Women)</w:t>
+            </w:r>
+          </w:p>
+        </w:tc>
+        <w:tc>
+          <w:tcPr>
+            <w:tcW w:type="dxa" w:w="1600"/>
+            <w:tcMar>
+              <w:top w:type="dxa" w:w="60"/>
+              <w:left w:type="dxa" w:w="100"/>
+              <w:bottom w:type="dxa" w:w="60"/>
+              <w:right w:type="dxa" w:w="100"/>
+            </w:tcMar>
+            <w:vAlign w:val="center"/>
+          </w:tcPr>
+          <w:p>
+            <w:pPr>
+              <w:jc w:val="center"/>
+            </w:pPr>
+            <w:r>
+              <w:rPr>
+                <w:b w:val="false"/>
+                <w:bCs w:val="false"/>
+                <w:color w:val="000000"/>
+                <w:sz w:val="18"/>
+                <w:szCs w:val="18"/>
+              </w:rPr>
+              <w:t xml:space="preserve">Legwear</w:t>
+            </w:r>
+          </w:p>
+        </w:tc>
+        <w:tc>
+          <w:tcPr>
+            <w:tcW w:type="dxa" w:w="1350"/>
+            <w:tcMar>
+              <w:top w:type="dxa" w:w="60"/>
+              <w:left w:type="dxa" w:w="100"/>
+              <w:bottom w:type="dxa" w:w="60"/>
+              <w:right w:type="dxa" w:w="100"/>
+            </w:tcMar>
+            <w:vAlign w:val="center"/>
+          </w:tcPr>
+          <w:p>
+            <w:pPr>
+              <w:jc w:val="center"/>
+            </w:pPr>
+            <w:r>
+              <w:rPr>
+                <w:b w:val="false"/>
+                <w:bCs w:val="false"/>
+                <w:color w:val="000000"/>
+                <w:sz w:val="18"/>
+                <w:szCs w:val="18"/>
+              </w:rPr>
+              <w:t xml:space="preserve">2.67M</w:t>
+            </w:r>
+          </w:p>
+        </w:tc>
+        <w:tc>
+          <w:tcPr>
+            <w:tcW w:type="dxa" w:w="1250"/>
+            <w:tcMar>
+              <w:top w:type="dxa" w:w="60"/>
+              <w:left w:type="dxa" w:w="100"/>
+              <w:bottom w:type="dxa" w:w="60"/>
+              <w:right w:type="dxa" w:w="100"/>
+            </w:tcMar>
+            <w:vAlign w:val="center"/>
+          </w:tcPr>
+          <w:p>
+            <w:pPr>
+              <w:jc w:val="center"/>
+            </w:pPr>
+            <w:r>
+              <w:rPr>
+                <w:b w:val="false"/>
+                <w:bCs w:val="false"/>
+                <w:color w:val="000000"/>
+                <w:sz w:val="18"/>
+                <w:szCs w:val="18"/>
+              </w:rPr>
+              <w:t xml:space="preserve">-26.9%</w:t>
+            </w:r>
+          </w:p>
+        </w:tc>
+        <w:tc>
+          <w:tcPr>
+            <w:tcW w:type="dxa" w:w="1250"/>
+            <w:tcMar>
+              <w:top w:type="dxa" w:w="60"/>
+              <w:left w:type="dxa" w:w="100"/>
+              <w:bottom w:type="dxa" w:w="60"/>
+              <w:right w:type="dxa" w:w="100"/>
+            </w:tcMar>
+            <w:vAlign w:val="center"/>
+          </w:tcPr>
+          <w:p>
+            <w:pPr>
+              <w:jc w:val="center"/>
+            </w:pPr>
+            <w:r>
+              <w:rPr>
+                <w:b w:val="false"/>
+                <w:bCs w:val="false"/>
+                <w:color w:val="000000"/>
+                <w:sz w:val="18"/>
+                <w:szCs w:val="18"/>
+              </w:rPr>
+              <w:t xml:space="preserve">48.9%</w:t>
+            </w:r>
+          </w:p>
+        </w:tc>
+      </w:tr>
+      <w:tr>
+        <w:tc>
+          <w:tcPr>
+            <w:tcW w:type="dxa" w:w="2900"/>
+            <w:shd w:fill="F5F5F5" w:val="clear"/>
+            <w:tcMar>
+              <w:top w:type="dxa" w:w="60"/>
+              <w:left w:type="dxa" w:w="100"/>
+              <w:bottom w:type="dxa" w:w="60"/>
+              <w:right w:type="dxa" w:w="100"/>
+            </w:tcMar>
+            <w:vAlign w:val="center"/>
+          </w:tcPr>
+          <w:p>
+            <w:pPr>
+              <w:jc w:val="left"/>
+            </w:pPr>
+            <w:r>
+              <w:rPr>
+                <w:b w:val="false"/>
+                <w:bCs w:val="false"/>
+                <w:color w:val="000000"/>
+                <w:sz w:val="18"/>
+                <w:szCs w:val="18"/>
+              </w:rPr>
+              <w:t xml:space="preserve">Mid Standard Pant (Men)</w:t>
+            </w:r>
+          </w:p>
+        </w:tc>
+        <w:tc>
+          <w:tcPr>
+            <w:tcW w:type="dxa" w:w="1600"/>
+            <w:shd w:fill="F5F5F5" w:val="clear"/>
+            <w:tcMar>
+              <w:top w:type="dxa" w:w="60"/>
+              <w:left w:type="dxa" w:w="100"/>
+              <w:bottom w:type="dxa" w:w="60"/>
+              <w:right w:type="dxa" w:w="100"/>
+            </w:tcMar>
+            <w:vAlign w:val="center"/>
+          </w:tcPr>
+          <w:p>
+            <w:pPr>
+              <w:jc w:val="center"/>
+            </w:pPr>
+            <w:r>
+              <w:rPr>
+                <w:b w:val="false"/>
+                <w:bCs w:val="false"/>
+                <w:color w:val="000000"/>
+                <w:sz w:val="18"/>
+                <w:szCs w:val="18"/>
+              </w:rPr>
+              <w:t xml:space="preserve">Legwear</w:t>
+            </w:r>
+          </w:p>
+        </w:tc>
+        <w:tc>
+          <w:tcPr>
+            <w:tcW w:type="dxa" w:w="1350"/>
+            <w:shd w:fill="F5F5F5" w:val="clear"/>
+            <w:tcMar>
+              <w:top w:type="dxa" w:w="60"/>
+              <w:left w:type="dxa" w:w="100"/>
+              <w:bottom w:type="dxa" w:w="60"/>
+              <w:right w:type="dxa" w:w="100"/>
+            </w:tcMar>
+            <w:vAlign w:val="center"/>
+          </w:tcPr>
+          <w:p>
+            <w:pPr>
+              <w:jc w:val="center"/>
+            </w:pPr>
+            <w:r>
+              <w:rPr>
+                <w:b w:val="false"/>
+                <w:bCs w:val="false"/>
+                <w:color w:val="000000"/>
+                <w:sz w:val="18"/>
+                <w:szCs w:val="18"/>
+              </w:rPr>
+              <w:t xml:space="preserve">2.62M</w:t>
+            </w:r>
+          </w:p>
+        </w:tc>
+        <w:tc>
+          <w:tcPr>
+            <w:tcW w:type="dxa" w:w="1250"/>
+            <w:shd w:fill="F5F5F5" w:val="clear"/>
+            <w:tcMar>
+              <w:top w:type="dxa" w:w="60"/>
+              <w:left w:type="dxa" w:w="100"/>
+              <w:bottom w:type="dxa" w:w="60"/>
+              <w:right w:type="dxa" w:w="100"/>
+            </w:tcMar>
+            <w:vAlign w:val="center"/>
+          </w:tcPr>
+          <w:p>
+            <w:pPr>
+              <w:jc w:val="center"/>
+            </w:pPr>
+            <w:r>
+              <w:rPr>
+                <w:b w:val="false"/>
+                <w:bCs w:val="false"/>
+                <w:color w:val="000000"/>
+                <w:sz w:val="18"/>
+                <w:szCs w:val="18"/>
+              </w:rPr>
+              <w:t xml:space="preserve">-35.1%</w:t>
+            </w:r>
+          </w:p>
+        </w:tc>
+        <w:tc>
+          <w:tcPr>
+            <w:tcW w:type="dxa" w:w="1250"/>
+            <w:shd w:fill="F5F5F5" w:val="clear"/>
+            <w:tcMar>
+              <w:top w:type="dxa" w:w="60"/>
+              <w:left w:type="dxa" w:w="100"/>
+              <w:bottom w:type="dxa" w:w="60"/>
+              <w:right w:type="dxa" w:w="100"/>
+            </w:tcMar>
+            <w:vAlign w:val="center"/>
+          </w:tcPr>
+          <w:p>
+            <w:pPr>
+              <w:jc w:val="center"/>
+            </w:pPr>
+            <w:r>
+              <w:rPr>
+                <w:b w:val="false"/>
+                <w:bCs w:val="false"/>
+                <w:color w:val="000000"/>
+                <w:sz w:val="18"/>
+                <w:szCs w:val="18"/>
+              </w:rPr>
+              <w:t xml:space="preserve">54.0%</w:t>
+            </w:r>
+          </w:p>
+        </w:tc>
+      </w:tr>
+      <w:tr>
+        <w:tc>
+          <w:tcPr>
+            <w:tcW w:type="dxa" w:w="2900"/>
+            <w:tcMar>
+              <w:top w:type="dxa" w:w="60"/>
+              <w:left w:type="dxa" w:w="100"/>
+              <w:bottom w:type="dxa" w:w="60"/>
+              <w:right w:type="dxa" w:w="100"/>
+            </w:tcMar>
+            <w:vAlign w:val="center"/>
+          </w:tcPr>
+          <w:p>
+            <w:pPr>
+              <w:jc w:val="left"/>
+            </w:pPr>
+            <w:r>
+              <w:rPr>
+                <w:b w:val="false"/>
+                <w:bCs w:val="false"/>
+                <w:color w:val="000000"/>
+                <w:sz w:val="18"/>
+                <w:szCs w:val="18"/>
+              </w:rPr>
+              <w:t xml:space="preserve">Long Mimic Parka (Women)</w:t>
+            </w:r>
+          </w:p>
+        </w:tc>
+        <w:tc>
+          <w:tcPr>
+            <w:tcW w:type="dxa" w:w="1600"/>
+            <w:tcMar>
+              <w:top w:type="dxa" w:w="60"/>
+              <w:left w:type="dxa" w:w="100"/>
+              <w:bottom w:type="dxa" w:w="60"/>
+              <w:right w:type="dxa" w:w="100"/>
+            </w:tcMar>
+            <w:vAlign w:val="center"/>
+          </w:tcPr>
+          <w:p>
+            <w:pPr>
+              <w:jc w:val="center"/>
+            </w:pPr>
+            <w:r>
+              <w:rPr>
+                <w:b w:val="false"/>
+                <w:bCs w:val="false"/>
+                <w:color w:val="000000"/>
+                <w:sz w:val="18"/>
+                <w:szCs w:val="18"/>
+              </w:rPr>
+              <w:t xml:space="preserve">Insulation</w:t>
+            </w:r>
+          </w:p>
+        </w:tc>
+        <w:tc>
+          <w:tcPr>
+            <w:tcW w:type="dxa" w:w="1350"/>
+            <w:tcMar>
+              <w:top w:type="dxa" w:w="60"/>
+              <w:left w:type="dxa" w:w="100"/>
+              <w:bottom w:type="dxa" w:w="60"/>
+              <w:right w:type="dxa" w:w="100"/>
+            </w:tcMar>
+            <w:vAlign w:val="center"/>
+          </w:tcPr>
+          <w:p>
+            <w:pPr>
+              <w:jc w:val="center"/>
+            </w:pPr>
+            <w:r>
+              <w:rPr>
+                <w:b w:val="false"/>
+                <w:bCs w:val="false"/>
+                <w:color w:val="000000"/>
+                <w:sz w:val="18"/>
+                <w:szCs w:val="18"/>
+              </w:rPr>
+              <w:t xml:space="preserve">2.45M</w:t>
+            </w:r>
+          </w:p>
+        </w:tc>
+        <w:tc>
+          <w:tcPr>
+            <w:tcW w:type="dxa" w:w="1250"/>
+            <w:tcMar>
+              <w:top w:type="dxa" w:w="60"/>
+              <w:left w:type="dxa" w:w="100"/>
+              <w:bottom w:type="dxa" w:w="60"/>
+              <w:right w:type="dxa" w:w="100"/>
+            </w:tcMar>
+            <w:vAlign w:val="center"/>
+          </w:tcPr>
+          <w:p>
+            <w:pPr>
+              <w:jc w:val="center"/>
+            </w:pPr>
+            <w:r>
+              <w:rPr>
+                <w:b w:val="false"/>
+                <w:bCs w:val="false"/>
+                <w:color w:val="000000"/>
+                <w:sz w:val="18"/>
+                <w:szCs w:val="18"/>
+              </w:rPr>
+              <w:t xml:space="preserve">-44.2%</w:t>
+            </w:r>
+          </w:p>
+        </w:tc>
+        <w:tc>
+          <w:tcPr>
+            <w:tcW w:type="dxa" w:w="1250"/>
+            <w:tcMar>
+              <w:top w:type="dxa" w:w="60"/>
+              <w:left w:type="dxa" w:w="100"/>
+              <w:bottom w:type="dxa" w:w="60"/>
+              <w:right w:type="dxa" w:w="100"/>
+            </w:tcMar>
+            <w:vAlign w:val="center"/>
+          </w:tcPr>
+          <w:p>
+            <w:pPr>
+              <w:jc w:val="center"/>
+            </w:pPr>
+            <w:r>
+              <w:rPr>
+                <w:b w:val="false"/>
+                <w:bCs w:val="false"/>
+                <w:color w:val="000000"/>
+                <w:sz w:val="18"/>
+                <w:szCs w:val="18"/>
+              </w:rPr>
+              <w:t xml:space="preserve">48.0%</w:t>
+            </w:r>
+          </w:p>
+        </w:tc>
+      </w:tr>
+      <w:tr>
+        <w:tc>
+          <w:tcPr>
+            <w:tcW w:type="dxa" w:w="2900"/>
+            <w:shd w:fill="F5F5F5" w:val="clear"/>
+            <w:tcMar>
+              <w:top w:type="dxa" w:w="60"/>
+              <w:left w:type="dxa" w:w="100"/>
+              <w:bottom w:type="dxa" w:w="60"/>
+              <w:right w:type="dxa" w:w="100"/>
+            </w:tcMar>
+            <w:vAlign w:val="center"/>
+          </w:tcPr>
+          <w:p>
+            <w:pPr>
+              <w:jc w:val="left"/>
+            </w:pPr>
+            <w:r>
+              <w:rPr>
+                <w:b w:val="false"/>
+                <w:bCs w:val="false"/>
+                <w:color w:val="000000"/>
+                <w:sz w:val="18"/>
+                <w:szCs w:val="18"/>
+              </w:rPr>
+              <w:t xml:space="preserve">Mid Slim Pant (Men)</w:t>
+            </w:r>
+          </w:p>
+        </w:tc>
+        <w:tc>
+          <w:tcPr>
+            <w:tcW w:type="dxa" w:w="1600"/>
+            <w:shd w:fill="F5F5F5" w:val="clear"/>
+            <w:tcMar>
+              <w:top w:type="dxa" w:w="60"/>
+              <w:left w:type="dxa" w:w="100"/>
+              <w:bottom w:type="dxa" w:w="60"/>
+              <w:right w:type="dxa" w:w="100"/>
+            </w:tcMar>
+            <w:vAlign w:val="center"/>
+          </w:tcPr>
+          <w:p>
+            <w:pPr>
+              <w:jc w:val="center"/>
+            </w:pPr>
+            <w:r>
+              <w:rPr>
+                <w:b w:val="false"/>
+                <w:bCs w:val="false"/>
+                <w:color w:val="000000"/>
+                <w:sz w:val="18"/>
+                <w:szCs w:val="18"/>
+              </w:rPr>
+              <w:t xml:space="preserve">Legwear</w:t>
+            </w:r>
+          </w:p>
+        </w:tc>
+        <w:tc>
+          <w:tcPr>
+            <w:tcW w:type="dxa" w:w="1350"/>
+            <w:shd w:fill="F5F5F5" w:val="clear"/>
+            <w:tcMar>
+              <w:top w:type="dxa" w:w="60"/>
+              <w:left w:type="dxa" w:w="100"/>
+              <w:bottom w:type="dxa" w:w="60"/>
+              <w:right w:type="dxa" w:w="100"/>
+            </w:tcMar>
+            <w:vAlign w:val="center"/>
+          </w:tcPr>
+          <w:p>
+            <w:pPr>
+              <w:jc w:val="center"/>
+            </w:pPr>
+            <w:r>
+              <w:rPr>
+                <w:b w:val="false"/>
+                <w:bCs w:val="false"/>
+                <w:color w:val="000000"/>
+                <w:sz w:val="18"/>
+                <w:szCs w:val="18"/>
+              </w:rPr>
+              <w:t xml:space="preserve">2.34M</w:t>
+            </w:r>
+          </w:p>
+        </w:tc>
+        <w:tc>
+          <w:tcPr>
+            <w:tcW w:type="dxa" w:w="1250"/>
+            <w:shd w:fill="F5F5F5" w:val="clear"/>
+            <w:tcMar>
+              <w:top w:type="dxa" w:w="60"/>
+              <w:left w:type="dxa" w:w="100"/>
+              <w:bottom w:type="dxa" w:w="60"/>
+              <w:right w:type="dxa" w:w="100"/>
+            </w:tcMar>
+            <w:vAlign w:val="center"/>
+          </w:tcPr>
+          <w:p>
+            <w:pPr>
+              <w:jc w:val="center"/>
+            </w:pPr>
+            <w:r>
+              <w:rPr>
+                <w:b w:val="false"/>
+                <w:bCs w:val="false"/>
+                <w:color w:val="000000"/>
+                <w:sz w:val="18"/>
+                <w:szCs w:val="18"/>
+              </w:rPr>
+              <w:t xml:space="preserve">-35.2%</w:t>
+            </w:r>
+          </w:p>
+        </w:tc>
+        <w:tc>
+          <w:tcPr>
+            <w:tcW w:type="dxa" w:w="1250"/>
+            <w:shd w:fill="F5F5F5" w:val="clear"/>
+            <w:tcMar>
+              <w:top w:type="dxa" w:w="60"/>
+              <w:left w:type="dxa" w:w="100"/>
+              <w:bottom w:type="dxa" w:w="60"/>
+              <w:right w:type="dxa" w:w="100"/>
+            </w:tcMar>
+            <w:vAlign w:val="center"/>
+          </w:tcPr>
+          <w:p>
+            <w:pPr>
+              <w:jc w:val="center"/>
+            </w:pPr>
+            <w:r>
+              <w:rPr>
+                <w:b w:val="false"/>
+                <w:bCs w:val="false"/>
+                <w:color w:val="000000"/>
+                <w:sz w:val="18"/>
+                <w:szCs w:val="18"/>
+              </w:rPr>
+              <w:t xml:space="preserve">53.7%</w:t>
+            </w:r>
+          </w:p>
+        </w:tc>
+      </w:tr>
+      <w:tr>
+        <w:tc>
+          <w:tcPr>
+            <w:tcW w:type="dxa" w:w="2900"/>
+            <w:tcMar>
+              <w:top w:type="dxa" w:w="60"/>
+              <w:left w:type="dxa" w:w="100"/>
+              <w:bottom w:type="dxa" w:w="60"/>
+              <w:right w:type="dxa" w:w="100"/>
+            </w:tcMar>
+            <w:vAlign w:val="center"/>
+          </w:tcPr>
+          <w:p>
+            <w:pPr>
+              <w:jc w:val="left"/>
+            </w:pPr>
+            <w:r>
+              <w:rPr>
+                <w:b w:val="false"/>
+                <w:bCs w:val="false"/>
+                <w:color w:val="000000"/>
+                <w:sz w:val="18"/>
+                <w:szCs w:val="18"/>
+              </w:rPr>
+              <w:t xml:space="preserve">Mimic Alert Hood (Men)</w:t>
+            </w:r>
+          </w:p>
+        </w:tc>
+        <w:tc>
+          <w:tcPr>
+            <w:tcW w:type="dxa" w:w="1600"/>
+            <w:tcMar>
+              <w:top w:type="dxa" w:w="60"/>
+              <w:left w:type="dxa" w:w="100"/>
+              <w:bottom w:type="dxa" w:w="60"/>
+              <w:right w:type="dxa" w:w="100"/>
+            </w:tcMar>
+            <w:vAlign w:val="center"/>
+          </w:tcPr>
+          <w:p>
+            <w:pPr>
+              <w:jc w:val="center"/>
+            </w:pPr>
+            <w:r>
+              <w:rPr>
+                <w:b w:val="false"/>
+                <w:bCs w:val="false"/>
+                <w:color w:val="000000"/>
+                <w:sz w:val="18"/>
+                <w:szCs w:val="18"/>
+              </w:rPr>
+              <w:t xml:space="preserve">Insulation</w:t>
+            </w:r>
+          </w:p>
+        </w:tc>
+        <w:tc>
+          <w:tcPr>
+            <w:tcW w:type="dxa" w:w="1350"/>
+            <w:tcMar>
+              <w:top w:type="dxa" w:w="60"/>
+              <w:left w:type="dxa" w:w="100"/>
+              <w:bottom w:type="dxa" w:w="60"/>
+              <w:right w:type="dxa" w:w="100"/>
+            </w:tcMar>
+            <w:vAlign w:val="center"/>
+          </w:tcPr>
+          <w:p>
+            <w:pPr>
+              <w:jc w:val="center"/>
+            </w:pPr>
+            <w:r>
+              <w:rPr>
+                <w:b w:val="false"/>
+                <w:bCs w:val="false"/>
+                <w:color w:val="000000"/>
+                <w:sz w:val="18"/>
+                <w:szCs w:val="18"/>
+              </w:rPr>
+              <w:t xml:space="preserve">2.30M</w:t>
+            </w:r>
+          </w:p>
+        </w:tc>
+        <w:tc>
+          <w:tcPr>
+            <w:tcW w:type="dxa" w:w="1250"/>
+            <w:tcMar>
+              <w:top w:type="dxa" w:w="60"/>
+              <w:left w:type="dxa" w:w="100"/>
+              <w:bottom w:type="dxa" w:w="60"/>
+              <w:right w:type="dxa" w:w="100"/>
+            </w:tcMar>
+            <w:vAlign w:val="center"/>
+          </w:tcPr>
+          <w:p>
+            <w:pPr>
+              <w:jc w:val="center"/>
+            </w:pPr>
+            <w:r>
+              <w:rPr>
+                <w:b w:val="false"/>
+                <w:bCs w:val="false"/>
+                <w:color w:val="000000"/>
+                <w:sz w:val="18"/>
+                <w:szCs w:val="18"/>
+              </w:rPr>
+              <w:t xml:space="preserve">-26.7%</w:t>
+            </w:r>
+          </w:p>
+        </w:tc>
+        <w:tc>
+          <w:tcPr>
+            <w:tcW w:type="dxa" w:w="1250"/>
+            <w:tcMar>
+              <w:top w:type="dxa" w:w="60"/>
+              <w:left w:type="dxa" w:w="100"/>
+              <w:bottom w:type="dxa" w:w="60"/>
+              <w:right w:type="dxa" w:w="100"/>
+            </w:tcMar>
+            <w:vAlign w:val="center"/>
+          </w:tcPr>
+          <w:p>
+            <w:pPr>
+              <w:jc w:val="center"/>
+            </w:pPr>
+            <w:r>
+              <w:rPr>
+                <w:b w:val="false"/>
+                <w:bCs w:val="false"/>
+                <w:color w:val="000000"/>
+                <w:sz w:val="18"/>
+                <w:szCs w:val="18"/>
+              </w:rPr>
+              <w:t xml:space="preserve">52.8%</w:t>
+            </w:r>
+          </w:p>
+        </w:tc>
+      </w:tr>
+      <w:tr>
+        <w:tc>
+          <w:tcPr>
+            <w:tcW w:type="dxa" w:w="2900"/>
+            <w:shd w:fill="F5F5F5" w:val="clear"/>
+            <w:tcMar>
+              <w:top w:type="dxa" w:w="60"/>
+              <w:left w:type="dxa" w:w="100"/>
+              <w:bottom w:type="dxa" w:w="60"/>
+              <w:right w:type="dxa" w:w="100"/>
+            </w:tcMar>
+            <w:vAlign w:val="center"/>
+          </w:tcPr>
+          <w:p>
+            <w:pPr>
+              <w:jc w:val="left"/>
+            </w:pPr>
+            <w:r>
+              <w:rPr>
+                <w:b w:val="false"/>
+                <w:bCs w:val="false"/>
+                <w:color w:val="000000"/>
+                <w:sz w:val="18"/>
+                <w:szCs w:val="18"/>
+              </w:rPr>
+              <w:t xml:space="preserve">Salix Proof Mimic Parka (Women)</w:t>
+            </w:r>
+          </w:p>
+        </w:tc>
+        <w:tc>
+          <w:tcPr>
+            <w:tcW w:type="dxa" w:w="1600"/>
+            <w:shd w:fill="F5F5F5" w:val="clear"/>
+            <w:tcMar>
+              <w:top w:type="dxa" w:w="60"/>
+              <w:left w:type="dxa" w:w="100"/>
+              <w:bottom w:type="dxa" w:w="60"/>
+              <w:right w:type="dxa" w:w="100"/>
+            </w:tcMar>
+            <w:vAlign w:val="center"/>
+          </w:tcPr>
+          <w:p>
+            <w:pPr>
+              <w:jc w:val="center"/>
+            </w:pPr>
+            <w:r>
+              <w:rPr>
+                <w:b w:val="false"/>
+                <w:bCs w:val="false"/>
+                <w:color w:val="000000"/>
+                <w:sz w:val="18"/>
+                <w:szCs w:val="18"/>
+              </w:rPr>
+              <w:t xml:space="preserve">Insulation</w:t>
+            </w:r>
+          </w:p>
+        </w:tc>
+        <w:tc>
+          <w:tcPr>
+            <w:tcW w:type="dxa" w:w="1350"/>
+            <w:shd w:fill="F5F5F5" w:val="clear"/>
+            <w:tcMar>
+              <w:top w:type="dxa" w:w="60"/>
+              <w:left w:type="dxa" w:w="100"/>
+              <w:bottom w:type="dxa" w:w="60"/>
+              <w:right w:type="dxa" w:w="100"/>
+            </w:tcMar>
+            <w:vAlign w:val="center"/>
+          </w:tcPr>
+          <w:p>
+            <w:pPr>
+              <w:jc w:val="center"/>
+            </w:pPr>
+            <w:r>
+              <w:rPr>
+                <w:b w:val="false"/>
+                <w:bCs w:val="false"/>
+                <w:color w:val="000000"/>
+                <w:sz w:val="18"/>
+                <w:szCs w:val="18"/>
+              </w:rPr>
+              <w:t xml:space="preserve">1.89M</w:t>
+            </w:r>
+          </w:p>
+        </w:tc>
+        <w:tc>
+          <w:tcPr>
+            <w:tcW w:type="dxa" w:w="1250"/>
+            <w:shd w:fill="F5F5F5" w:val="clear"/>
+            <w:tcMar>
+              <w:top w:type="dxa" w:w="60"/>
+              <w:left w:type="dxa" w:w="100"/>
+              <w:bottom w:type="dxa" w:w="60"/>
+              <w:right w:type="dxa" w:w="100"/>
+            </w:tcMar>
+            <w:vAlign w:val="center"/>
+          </w:tcPr>
+          <w:p>
+            <w:pPr>
+              <w:jc w:val="center"/>
+            </w:pPr>
+            <w:r>
+              <w:rPr>
+                <w:b w:val="false"/>
+                <w:bCs w:val="false"/>
+                <w:color w:val="000000"/>
+                <w:sz w:val="18"/>
+                <w:szCs w:val="18"/>
+              </w:rPr>
+              <w:t xml:space="preserve">-20.8%</w:t>
+            </w:r>
+          </w:p>
+        </w:tc>
+        <w:tc>
+          <w:tcPr>
+            <w:tcW w:type="dxa" w:w="1250"/>
+            <w:shd w:fill="F5F5F5" w:val="clear"/>
+            <w:tcMar>
+              <w:top w:type="dxa" w:w="60"/>
+              <w:left w:type="dxa" w:w="100"/>
+              <w:bottom w:type="dxa" w:w="60"/>
+              <w:right w:type="dxa" w:w="100"/>
+            </w:tcMar>
+            <w:vAlign w:val="center"/>
+          </w:tcPr>
+          <w:p>
+            <w:pPr>
+              <w:jc w:val="center"/>
+            </w:pPr>
+            <w:r>
+              <w:rPr>
+                <w:b w:val="false"/>
+                <w:bCs w:val="false"/>
+                <w:color w:val="000000"/>
+                <w:sz w:val="18"/>
+                <w:szCs w:val="18"/>
+              </w:rPr>
+              <w:t xml:space="preserve">54.9%</w:t>
+            </w:r>
+          </w:p>
+        </w:tc>
+      </w:tr>
+      <w:tr>
+        <w:tc>
+          <w:tcPr>
+            <w:tcW w:type="dxa" w:w="2900"/>
+            <w:tcMar>
+              <w:top w:type="dxa" w:w="60"/>
+              <w:left w:type="dxa" w:w="100"/>
+              <w:bottom w:type="dxa" w:w="60"/>
+              <w:right w:type="dxa" w:w="100"/>
+            </w:tcMar>
+            <w:vAlign w:val="center"/>
+          </w:tcPr>
+          <w:p>
+            <w:pPr>
+              <w:jc w:val="left"/>
+            </w:pPr>
+            <w:r>
+              <w:rPr>
+                <w:b w:val="false"/>
+                <w:bCs w:val="false"/>
+                <w:color w:val="000000"/>
+                <w:sz w:val="18"/>
+                <w:szCs w:val="18"/>
+              </w:rPr>
+              <w:t xml:space="preserve">Rugged Slim Pant (Men)</w:t>
+            </w:r>
+          </w:p>
+        </w:tc>
+        <w:tc>
+          <w:tcPr>
+            <w:tcW w:type="dxa" w:w="1600"/>
+            <w:tcMar>
+              <w:top w:type="dxa" w:w="60"/>
+              <w:left w:type="dxa" w:w="100"/>
+              <w:bottom w:type="dxa" w:w="60"/>
+              <w:right w:type="dxa" w:w="100"/>
+            </w:tcMar>
+            <w:vAlign w:val="center"/>
+          </w:tcPr>
+          <w:p>
+            <w:pPr>
+              <w:jc w:val="center"/>
+            </w:pPr>
+            <w:r>
+              <w:rPr>
+                <w:b w:val="false"/>
+                <w:bCs w:val="false"/>
+                <w:color w:val="000000"/>
+                <w:sz w:val="18"/>
+                <w:szCs w:val="18"/>
+              </w:rPr>
+              <w:t xml:space="preserve">Legwear</w:t>
+            </w:r>
+          </w:p>
+        </w:tc>
+        <w:tc>
+          <w:tcPr>
+            <w:tcW w:type="dxa" w:w="1350"/>
+            <w:tcMar>
+              <w:top w:type="dxa" w:w="60"/>
+              <w:left w:type="dxa" w:w="100"/>
+              <w:bottom w:type="dxa" w:w="60"/>
+              <w:right w:type="dxa" w:w="100"/>
+            </w:tcMar>
+            <w:vAlign w:val="center"/>
+          </w:tcPr>
+          <w:p>
+            <w:pPr>
+              <w:jc w:val="center"/>
+            </w:pPr>
+            <w:r>
+              <w:rPr>
+                <w:b w:val="false"/>
+                <w:bCs w:val="false"/>
+                <w:color w:val="000000"/>
+                <w:sz w:val="18"/>
+                <w:szCs w:val="18"/>
+              </w:rPr>
+              <w:t xml:space="preserve">1.77M</w:t>
+            </w:r>
+          </w:p>
+        </w:tc>
+        <w:tc>
+          <w:tcPr>
+            <w:tcW w:type="dxa" w:w="1250"/>
+            <w:tcMar>
+              <w:top w:type="dxa" w:w="60"/>
+              <w:left w:type="dxa" w:w="100"/>
+              <w:bottom w:type="dxa" w:w="60"/>
+              <w:right w:type="dxa" w:w="100"/>
+            </w:tcMar>
+            <w:vAlign w:val="center"/>
+          </w:tcPr>
+          <w:p>
+            <w:pPr>
+              <w:jc w:val="center"/>
+            </w:pPr>
+            <w:r>
+              <w:rPr>
+                <w:b w:val="false"/>
+                <w:bCs w:val="false"/>
+                <w:color w:val="000000"/>
+                <w:sz w:val="18"/>
+                <w:szCs w:val="18"/>
+              </w:rPr>
+              <w:t xml:space="preserve">-36.7%</w:t>
+            </w:r>
+          </w:p>
+        </w:tc>
+        <w:tc>
+          <w:tcPr>
+            <w:tcW w:type="dxa" w:w="1250"/>
+            <w:tcMar>
+              <w:top w:type="dxa" w:w="60"/>
+              <w:left w:type="dxa" w:w="100"/>
+              <w:bottom w:type="dxa" w:w="60"/>
+              <w:right w:type="dxa" w:w="100"/>
+            </w:tcMar>
+            <w:vAlign w:val="center"/>
+          </w:tcPr>
+          <w:p>
+            <w:pPr>
+              <w:jc w:val="center"/>
+            </w:pPr>
+            <w:r>
+              <w:rPr>
+                <w:b w:val="false"/>
+                <w:bCs w:val="false"/>
+                <w:color w:val="000000"/>
+                <w:sz w:val="18"/>
+                <w:szCs w:val="18"/>
+              </w:rPr>
+              <w:t xml:space="preserve">58.4%</w:t>
+            </w:r>
+          </w:p>
+        </w:tc>
+      </w:tr>
+      <w:tr>
+        <w:tc>
+          <w:tcPr>
+            <w:tcW w:type="dxa" w:w="2900"/>
+            <w:shd w:fill="F5F5F5" w:val="clear"/>
+            <w:tcMar>
+              <w:top w:type="dxa" w:w="60"/>
+              <w:left w:type="dxa" w:w="100"/>
+              <w:bottom w:type="dxa" w:w="60"/>
+              <w:right w:type="dxa" w:w="100"/>
+            </w:tcMar>
+            <w:vAlign w:val="center"/>
+          </w:tcPr>
+          <w:p>
+            <w:pPr>
+              <w:jc w:val="left"/>
+            </w:pPr>
+            <w:r>
+              <w:rPr>
+                <w:b w:val="false"/>
+                <w:bCs w:val="false"/>
+                <w:color w:val="000000"/>
+                <w:sz w:val="18"/>
+                <w:szCs w:val="18"/>
+              </w:rPr>
+              <w:t xml:space="preserve">Mimic Alert Hood (Women)</w:t>
+            </w:r>
+          </w:p>
+        </w:tc>
+        <w:tc>
+          <w:tcPr>
+            <w:tcW w:type="dxa" w:w="1600"/>
+            <w:shd w:fill="F5F5F5" w:val="clear"/>
+            <w:tcMar>
+              <w:top w:type="dxa" w:w="60"/>
+              <w:left w:type="dxa" w:w="100"/>
+              <w:bottom w:type="dxa" w:w="60"/>
+              <w:right w:type="dxa" w:w="100"/>
+            </w:tcMar>
+            <w:vAlign w:val="center"/>
+          </w:tcPr>
+          <w:p>
+            <w:pPr>
+              <w:jc w:val="center"/>
+            </w:pPr>
+            <w:r>
+              <w:rPr>
+                <w:b w:val="false"/>
+                <w:bCs w:val="false"/>
+                <w:color w:val="000000"/>
+                <w:sz w:val="18"/>
+                <w:szCs w:val="18"/>
+              </w:rPr>
+              <w:t xml:space="preserve">Insulation</w:t>
+            </w:r>
+          </w:p>
+        </w:tc>
+        <w:tc>
+          <w:tcPr>
+            <w:tcW w:type="dxa" w:w="1350"/>
+            <w:shd w:fill="F5F5F5" w:val="clear"/>
+            <w:tcMar>
+              <w:top w:type="dxa" w:w="60"/>
+              <w:left w:type="dxa" w:w="100"/>
+              <w:bottom w:type="dxa" w:w="60"/>
+              <w:right w:type="dxa" w:w="100"/>
+            </w:tcMar>
+            <w:vAlign w:val="center"/>
+          </w:tcPr>
+          <w:p>
+            <w:pPr>
+              <w:jc w:val="center"/>
+            </w:pPr>
+            <w:r>
+              <w:rPr>
+                <w:b w:val="false"/>
+                <w:bCs w:val="false"/>
+                <w:color w:val="000000"/>
+                <w:sz w:val="18"/>
+                <w:szCs w:val="18"/>
+              </w:rPr>
+              <w:t xml:space="preserve">1.64M</w:t>
+            </w:r>
+          </w:p>
+        </w:tc>
+        <w:tc>
+          <w:tcPr>
+            <w:tcW w:type="dxa" w:w="1250"/>
+            <w:shd w:fill="F5F5F5" w:val="clear"/>
+            <w:tcMar>
+              <w:top w:type="dxa" w:w="60"/>
+              <w:left w:type="dxa" w:w="100"/>
+              <w:bottom w:type="dxa" w:w="60"/>
+              <w:right w:type="dxa" w:w="100"/>
+            </w:tcMar>
+            <w:vAlign w:val="center"/>
+          </w:tcPr>
+          <w:p>
+            <w:pPr>
+              <w:jc w:val="center"/>
+            </w:pPr>
+            <w:r>
+              <w:rPr>
+                <w:b w:val="false"/>
+                <w:bCs w:val="false"/>
+                <w:color w:val="000000"/>
+                <w:sz w:val="18"/>
+                <w:szCs w:val="18"/>
+              </w:rPr>
+              <w:t xml:space="preserve">-16.0%</w:t>
+            </w:r>
+          </w:p>
+        </w:tc>
+        <w:tc>
+          <w:tcPr>
+            <w:tcW w:type="dxa" w:w="1250"/>
+            <w:shd w:fill="F5F5F5" w:val="clear"/>
+            <w:tcMar>
+              <w:top w:type="dxa" w:w="60"/>
+              <w:left w:type="dxa" w:w="100"/>
+              <w:bottom w:type="dxa" w:w="60"/>
+              <w:right w:type="dxa" w:w="100"/>
+            </w:tcMar>
+            <w:vAlign w:val="center"/>
+          </w:tcPr>
+          <w:p>
+            <w:pPr>
+              <w:jc w:val="center"/>
+            </w:pPr>
+            <w:r>
+              <w:rPr>
+                <w:b w:val="false"/>
+                <w:bCs w:val="false"/>
+                <w:color w:val="000000"/>
+                <w:sz w:val="18"/>
+                <w:szCs w:val="18"/>
+              </w:rPr>
+              <w:t xml:space="preserve">55.9%</w:t>
+            </w:r>
+          </w:p>
+        </w:tc>
+      </w:tr>
+    </w:tbl>
+    <w:p>
+      <w:pPr>
+        <w:spacing w:after="160"/>
+      </w:pPr>
+      <w:r>
+        <w:t xml:space="preserve">Top 10 of the 159 not-found-anywhere franchises, by 2025 sales:</w:t>
+      </w:r>
+    </w:p>
+    <w:tbl>
+      <w:tblPr>
+        <w:tblW w:type="dxa" w:w="9350"/>
+        <w:tblBorders>
+          <w:top w:val="single" w:color="auto" w:sz="4"/>
+          <w:left w:val="single" w:color="auto" w:sz="4"/>
+          <w:bottom w:val="single" w:color="auto" w:sz="4"/>
+          <w:right w:val="single" w:color="auto" w:sz="4"/>
+          <w:insideH w:val="single" w:color="auto" w:sz="4"/>
+          <w:insideV w:val="single" w:color="auto" w:sz="4"/>
+        </w:tblBorders>
+      </w:tblPr>
+      <w:tblGrid>
+        <w:gridCol w:w="2900"/>
+        <w:gridCol w:w="1600"/>
+        <w:gridCol w:w="1350"/>
+        <w:gridCol w:w="1250"/>
+        <w:gridCol w:w="1250"/>
+      </w:tblGrid>
+      <w:tr>
+        <w:trPr>
+          <w:tblHeader/>
+        </w:trPr>
+        <w:tc>
+          <w:tcPr>
+            <w:tcW w:type="dxa" w:w="2900"/>
+            <w:shd w:fill="2F2F2F" w:val="clear"/>
+            <w:tcMar>
+              <w:top w:type="dxa" w:w="60"/>
+              <w:left w:type="dxa" w:w="100"/>
+              <w:bottom w:type="dxa" w:w="60"/>
+              <w:right w:type="dxa" w:w="100"/>
+            </w:tcMar>
+            <w:vAlign w:val="center"/>
+          </w:tcPr>
+          <w:p>
+            <w:pPr>
+              <w:jc w:val="left"/>
+            </w:pPr>
+            <w:r>
+              <w:rPr>
+                <w:b/>
+                <w:bCs/>
+                <w:color w:val="FFFFFF"/>
+                <w:sz w:val="18"/>
+                <w:szCs w:val="18"/>
+              </w:rPr>
+              <w:t xml:space="preserve">Franchise</w:t>
+            </w:r>
+          </w:p>
+        </w:tc>
+        <w:tc>
+          <w:tcPr>
+            <w:tcW w:type="dxa" w:w="1600"/>
+            <w:shd w:fill="2F2F2F" w:val="clear"/>
+            <w:tcMar>
+              <w:top w:type="dxa" w:w="60"/>
+              <w:left w:type="dxa" w:w="100"/>
+              <w:bottom w:type="dxa" w:w="60"/>
+              <w:right w:type="dxa" w:w="100"/>
+            </w:tcMar>
+            <w:vAlign w:val="center"/>
+          </w:tcPr>
+          <w:p>
+            <w:pPr>
+              <w:jc w:val="center"/>
+            </w:pPr>
+            <w:r>
+              <w:rPr>
+                <w:b/>
+                <w:bCs/>
+                <w:color w:val="FFFFFF"/>
+                <w:sz w:val="18"/>
+                <w:szCs w:val="18"/>
+              </w:rPr>
+              <w:t xml:space="preserve">Layer</w:t>
+            </w:r>
+          </w:p>
+        </w:tc>
+        <w:tc>
+          <w:tcPr>
+            <w:tcW w:type="dxa" w:w="1350"/>
+            <w:shd w:fill="2F2F2F" w:val="clear"/>
+            <w:tcMar>
+              <w:top w:type="dxa" w:w="60"/>
+              <w:left w:type="dxa" w:w="100"/>
+              <w:bottom w:type="dxa" w:w="60"/>
+              <w:right w:type="dxa" w:w="100"/>
+            </w:tcMar>
+            <w:vAlign w:val="center"/>
+          </w:tcPr>
+          <w:p>
+            <w:pPr>
+              <w:jc w:val="center"/>
+            </w:pPr>
+            <w:r>
+              <w:rPr>
+                <w:b/>
+                <w:bCs/>
+                <w:color w:val="FFFFFF"/>
+                <w:sz w:val="18"/>
+                <w:szCs w:val="18"/>
+              </w:rPr>
+              <w:t xml:space="preserve">Sales 2025</w:t>
+            </w:r>
+          </w:p>
+        </w:tc>
+        <w:tc>
+          <w:tcPr>
+            <w:tcW w:type="dxa" w:w="1250"/>
+            <w:shd w:fill="2F2F2F" w:val="clear"/>
+            <w:tcMar>
+              <w:top w:type="dxa" w:w="60"/>
+              <w:left w:type="dxa" w:w="100"/>
+              <w:bottom w:type="dxa" w:w="60"/>
+              <w:right w:type="dxa" w:w="100"/>
+            </w:tcMar>
+            <w:vAlign w:val="center"/>
+          </w:tcPr>
+          <w:p>
+            <w:pPr>
+              <w:jc w:val="center"/>
+            </w:pPr>
+            <w:r>
+              <w:rPr>
+                <w:b/>
+                <w:bCs/>
+                <w:color w:val="FFFFFF"/>
+                <w:sz w:val="18"/>
+                <w:szCs w:val="18"/>
+              </w:rPr>
+              <w:t xml:space="preserve">Growth %</w:t>
+            </w:r>
+          </w:p>
+        </w:tc>
+        <w:tc>
+          <w:tcPr>
+            <w:tcW w:type="dxa" w:w="1250"/>
+            <w:shd w:fill="2F2F2F" w:val="clear"/>
+            <w:tcMar>
+              <w:top w:type="dxa" w:w="60"/>
+              <w:left w:type="dxa" w:w="100"/>
+              <w:bottom w:type="dxa" w:w="60"/>
+              <w:right w:type="dxa" w:w="100"/>
+            </w:tcMar>
+            <w:vAlign w:val="center"/>
+          </w:tcPr>
+          <w:p>
+            <w:pPr>
+              <w:jc w:val="center"/>
+            </w:pPr>
+            <w:r>
+              <w:rPr>
+                <w:b/>
+                <w:bCs/>
+                <w:color w:val="FFFFFF"/>
+                <w:sz w:val="18"/>
+                <w:szCs w:val="18"/>
+              </w:rPr>
+              <w:t xml:space="preserve">GM% 2025</w:t>
+            </w:r>
+          </w:p>
+        </w:tc>
+      </w:tr>
+      <w:tr>
+        <w:tc>
+          <w:tcPr>
+            <w:tcW w:type="dxa" w:w="2900"/>
+            <w:tcMar>
+              <w:top w:type="dxa" w:w="60"/>
+              <w:left w:type="dxa" w:w="100"/>
+              <w:bottom w:type="dxa" w:w="60"/>
+              <w:right w:type="dxa" w:w="100"/>
+            </w:tcMar>
+            <w:vAlign w:val="center"/>
+          </w:tcPr>
+          <w:p>
+            <w:pPr>
+              <w:jc w:val="left"/>
+            </w:pPr>
+            <w:r>
+              <w:rPr>
+                <w:b w:val="false"/>
+                <w:bCs w:val="false"/>
+                <w:color w:val="000000"/>
+                <w:sz w:val="18"/>
+                <w:szCs w:val="18"/>
+              </w:rPr>
+              <w:t xml:space="preserve">Risberg Jacket (Men)</w:t>
+            </w:r>
+          </w:p>
+        </w:tc>
+        <w:tc>
+          <w:tcPr>
+            <w:tcW w:type="dxa" w:w="1600"/>
+            <w:tcMar>
+              <w:top w:type="dxa" w:w="60"/>
+              <w:left w:type="dxa" w:w="100"/>
+              <w:bottom w:type="dxa" w:w="60"/>
+              <w:right w:type="dxa" w:w="100"/>
+            </w:tcMar>
+            <w:vAlign w:val="center"/>
+          </w:tcPr>
+          <w:p>
+            <w:pPr>
+              <w:jc w:val="center"/>
+            </w:pPr>
+            <w:r>
+              <w:rPr>
+                <w:b w:val="false"/>
+                <w:bCs w:val="false"/>
+                <w:color w:val="000000"/>
+                <w:sz w:val="18"/>
+                <w:szCs w:val="18"/>
+              </w:rPr>
+              <w:t xml:space="preserve">Mid layer</w:t>
+            </w:r>
+          </w:p>
+        </w:tc>
+        <w:tc>
+          <w:tcPr>
+            <w:tcW w:type="dxa" w:w="1350"/>
+            <w:tcMar>
+              <w:top w:type="dxa" w:w="60"/>
+              <w:left w:type="dxa" w:w="100"/>
+              <w:bottom w:type="dxa" w:w="60"/>
+              <w:right w:type="dxa" w:w="100"/>
+            </w:tcMar>
+            <w:vAlign w:val="center"/>
+          </w:tcPr>
+          <w:p>
+            <w:pPr>
+              <w:jc w:val="center"/>
+            </w:pPr>
+            <w:r>
+              <w:rPr>
+                <w:b w:val="false"/>
+                <w:bCs w:val="false"/>
+                <w:color w:val="000000"/>
+                <w:sz w:val="18"/>
+                <w:szCs w:val="18"/>
+              </w:rPr>
+              <w:t xml:space="preserve">2.68M</w:t>
+            </w:r>
+          </w:p>
+        </w:tc>
+        <w:tc>
+          <w:tcPr>
+            <w:tcW w:type="dxa" w:w="1250"/>
+            <w:tcMar>
+              <w:top w:type="dxa" w:w="60"/>
+              <w:left w:type="dxa" w:w="100"/>
+              <w:bottom w:type="dxa" w:w="60"/>
+              <w:right w:type="dxa" w:w="100"/>
+            </w:tcMar>
+            <w:vAlign w:val="center"/>
+          </w:tcPr>
+          <w:p>
+            <w:pPr>
+              <w:jc w:val="center"/>
+            </w:pPr>
+            <w:r>
+              <w:rPr>
+                <w:b w:val="false"/>
+                <w:bCs w:val="false"/>
+                <w:color w:val="000000"/>
+                <w:sz w:val="18"/>
+                <w:szCs w:val="18"/>
+              </w:rPr>
+              <w:t xml:space="preserve">-24.6%</w:t>
+            </w:r>
+          </w:p>
+        </w:tc>
+        <w:tc>
+          <w:tcPr>
+            <w:tcW w:type="dxa" w:w="1250"/>
+            <w:tcMar>
+              <w:top w:type="dxa" w:w="60"/>
+              <w:left w:type="dxa" w:w="100"/>
+              <w:bottom w:type="dxa" w:w="60"/>
+              <w:right w:type="dxa" w:w="100"/>
+            </w:tcMar>
+            <w:vAlign w:val="center"/>
+          </w:tcPr>
+          <w:p>
+            <w:pPr>
+              <w:jc w:val="center"/>
+            </w:pPr>
+            <w:r>
+              <w:rPr>
+                <w:b w:val="false"/>
+                <w:bCs w:val="false"/>
+                <w:color w:val="000000"/>
+                <w:sz w:val="18"/>
+                <w:szCs w:val="18"/>
+              </w:rPr>
+              <w:t xml:space="preserve">54.3%</w:t>
+            </w:r>
+          </w:p>
+        </w:tc>
+      </w:tr>
+      <w:tr>
+        <w:tc>
+          <w:tcPr>
+            <w:tcW w:type="dxa" w:w="2900"/>
+            <w:shd w:fill="F5F5F5" w:val="clear"/>
+            <w:tcMar>
+              <w:top w:type="dxa" w:w="60"/>
+              <w:left w:type="dxa" w:w="100"/>
+              <w:bottom w:type="dxa" w:w="60"/>
+              <w:right w:type="dxa" w:w="100"/>
+            </w:tcMar>
+            <w:vAlign w:val="center"/>
+          </w:tcPr>
+          <w:p>
+            <w:pPr>
+              <w:jc w:val="left"/>
+            </w:pPr>
+            <w:r>
+              <w:rPr>
+                <w:b w:val="false"/>
+                <w:bCs w:val="false"/>
+                <w:color w:val="000000"/>
+                <w:sz w:val="18"/>
+                <w:szCs w:val="18"/>
+              </w:rPr>
+              <w:t xml:space="preserve">Vide 25 (Unisex)</w:t>
+            </w:r>
+          </w:p>
+        </w:tc>
+        <w:tc>
+          <w:tcPr>
+            <w:tcW w:type="dxa" w:w="1600"/>
+            <w:shd w:fill="F5F5F5" w:val="clear"/>
+            <w:tcMar>
+              <w:top w:type="dxa" w:w="60"/>
+              <w:left w:type="dxa" w:w="100"/>
+              <w:bottom w:type="dxa" w:w="60"/>
+              <w:right w:type="dxa" w:w="100"/>
+            </w:tcMar>
+            <w:vAlign w:val="center"/>
+          </w:tcPr>
+          <w:p>
+            <w:pPr>
+              <w:jc w:val="center"/>
+            </w:pPr>
+            <w:r>
+              <w:rPr>
+                <w:b w:val="false"/>
+                <w:bCs w:val="false"/>
+                <w:color w:val="000000"/>
+                <w:sz w:val="18"/>
+                <w:szCs w:val="18"/>
+              </w:rPr>
+              <w:t xml:space="preserve">Hiking packs</w:t>
+            </w:r>
+          </w:p>
+        </w:tc>
+        <w:tc>
+          <w:tcPr>
+            <w:tcW w:type="dxa" w:w="1350"/>
+            <w:shd w:fill="F5F5F5" w:val="clear"/>
+            <w:tcMar>
+              <w:top w:type="dxa" w:w="60"/>
+              <w:left w:type="dxa" w:w="100"/>
+              <w:bottom w:type="dxa" w:w="60"/>
+              <w:right w:type="dxa" w:w="100"/>
+            </w:tcMar>
+            <w:vAlign w:val="center"/>
+          </w:tcPr>
+          <w:p>
+            <w:pPr>
+              <w:jc w:val="center"/>
+            </w:pPr>
+            <w:r>
+              <w:rPr>
+                <w:b w:val="false"/>
+                <w:bCs w:val="false"/>
+                <w:color w:val="000000"/>
+                <w:sz w:val="18"/>
+                <w:szCs w:val="18"/>
+              </w:rPr>
+              <w:t xml:space="preserve">2.14M</w:t>
+            </w:r>
+          </w:p>
+        </w:tc>
+        <w:tc>
+          <w:tcPr>
+            <w:tcW w:type="dxa" w:w="1250"/>
+            <w:shd w:fill="F5F5F5" w:val="clear"/>
+            <w:tcMar>
+              <w:top w:type="dxa" w:w="60"/>
+              <w:left w:type="dxa" w:w="100"/>
+              <w:bottom w:type="dxa" w:w="60"/>
+              <w:right w:type="dxa" w:w="100"/>
+            </w:tcMar>
+            <w:vAlign w:val="center"/>
+          </w:tcPr>
+          <w:p>
+            <w:pPr>
+              <w:jc w:val="center"/>
+            </w:pPr>
+            <w:r>
+              <w:rPr>
+                <w:b w:val="false"/>
+                <w:bCs w:val="false"/>
+                <w:color w:val="000000"/>
+                <w:sz w:val="18"/>
+                <w:szCs w:val="18"/>
+              </w:rPr>
+              <w:t xml:space="preserve">-18.3%</w:t>
+            </w:r>
+          </w:p>
+        </w:tc>
+        <w:tc>
+          <w:tcPr>
+            <w:tcW w:type="dxa" w:w="1250"/>
+            <w:shd w:fill="F5F5F5" w:val="clear"/>
+            <w:tcMar>
+              <w:top w:type="dxa" w:w="60"/>
+              <w:left w:type="dxa" w:w="100"/>
+              <w:bottom w:type="dxa" w:w="60"/>
+              <w:right w:type="dxa" w:w="100"/>
+            </w:tcMar>
+            <w:vAlign w:val="center"/>
+          </w:tcPr>
+          <w:p>
+            <w:pPr>
+              <w:jc w:val="center"/>
+            </w:pPr>
+            <w:r>
+              <w:rPr>
+                <w:b w:val="false"/>
+                <w:bCs w:val="false"/>
+                <w:color w:val="000000"/>
+                <w:sz w:val="18"/>
+                <w:szCs w:val="18"/>
+              </w:rPr>
+              <w:t xml:space="preserve">52.2%</w:t>
+            </w:r>
+          </w:p>
+        </w:tc>
+      </w:tr>
+      <w:tr>
+        <w:tc>
+          <w:tcPr>
+            <w:tcW w:type="dxa" w:w="2900"/>
+            <w:tcMar>
+              <w:top w:type="dxa" w:w="60"/>
+              <w:left w:type="dxa" w:w="100"/>
+              <w:bottom w:type="dxa" w:w="60"/>
+              <w:right w:type="dxa" w:w="100"/>
+            </w:tcMar>
+            <w:vAlign w:val="center"/>
+          </w:tcPr>
+          <w:p>
+            <w:pPr>
+              <w:jc w:val="left"/>
+            </w:pPr>
+            <w:r>
+              <w:rPr>
+                <w:b w:val="false"/>
+                <w:bCs w:val="false"/>
+                <w:color w:val="000000"/>
+                <w:sz w:val="18"/>
+                <w:szCs w:val="18"/>
+              </w:rPr>
+              <w:t xml:space="preserve">Malung Pile Hood (Men)</w:t>
+            </w:r>
+          </w:p>
+        </w:tc>
+        <w:tc>
+          <w:tcPr>
+            <w:tcW w:type="dxa" w:w="1600"/>
+            <w:tcMar>
+              <w:top w:type="dxa" w:w="60"/>
+              <w:left w:type="dxa" w:w="100"/>
+              <w:bottom w:type="dxa" w:w="60"/>
+              <w:right w:type="dxa" w:w="100"/>
+            </w:tcMar>
+            <w:vAlign w:val="center"/>
+          </w:tcPr>
+          <w:p>
+            <w:pPr>
+              <w:jc w:val="center"/>
+            </w:pPr>
+            <w:r>
+              <w:rPr>
+                <w:b w:val="false"/>
+                <w:bCs w:val="false"/>
+                <w:color w:val="000000"/>
+                <w:sz w:val="18"/>
+                <w:szCs w:val="18"/>
+              </w:rPr>
+              <w:t xml:space="preserve">Mid layer</w:t>
+            </w:r>
+          </w:p>
+        </w:tc>
+        <w:tc>
+          <w:tcPr>
+            <w:tcW w:type="dxa" w:w="1350"/>
+            <w:tcMar>
+              <w:top w:type="dxa" w:w="60"/>
+              <w:left w:type="dxa" w:w="100"/>
+              <w:bottom w:type="dxa" w:w="60"/>
+              <w:right w:type="dxa" w:w="100"/>
+            </w:tcMar>
+            <w:vAlign w:val="center"/>
+          </w:tcPr>
+          <w:p>
+            <w:pPr>
+              <w:jc w:val="center"/>
+            </w:pPr>
+            <w:r>
+              <w:rPr>
+                <w:b w:val="false"/>
+                <w:bCs w:val="false"/>
+                <w:color w:val="000000"/>
+                <w:sz w:val="18"/>
+                <w:szCs w:val="18"/>
+              </w:rPr>
+              <w:t xml:space="preserve">1.20M</w:t>
+            </w:r>
+          </w:p>
+        </w:tc>
+        <w:tc>
+          <w:tcPr>
+            <w:tcW w:type="dxa" w:w="1250"/>
+            <w:tcMar>
+              <w:top w:type="dxa" w:w="60"/>
+              <w:left w:type="dxa" w:w="100"/>
+              <w:bottom w:type="dxa" w:w="60"/>
+              <w:right w:type="dxa" w:w="100"/>
+            </w:tcMar>
+            <w:vAlign w:val="center"/>
+          </w:tcPr>
+          <w:p>
+            <w:pPr>
+              <w:jc w:val="center"/>
+            </w:pPr>
+            <w:r>
+              <w:rPr>
+                <w:b w:val="false"/>
+                <w:bCs w:val="false"/>
+                <w:color w:val="000000"/>
+                <w:sz w:val="18"/>
+                <w:szCs w:val="18"/>
+              </w:rPr>
+              <w:t xml:space="preserve">-37.4%</w:t>
+            </w:r>
+          </w:p>
+        </w:tc>
+        <w:tc>
+          <w:tcPr>
+            <w:tcW w:type="dxa" w:w="1250"/>
+            <w:tcMar>
+              <w:top w:type="dxa" w:w="60"/>
+              <w:left w:type="dxa" w:w="100"/>
+              <w:bottom w:type="dxa" w:w="60"/>
+              <w:right w:type="dxa" w:w="100"/>
+            </w:tcMar>
+            <w:vAlign w:val="center"/>
+          </w:tcPr>
+          <w:p>
+            <w:pPr>
+              <w:jc w:val="center"/>
+            </w:pPr>
+            <w:r>
+              <w:rPr>
+                <w:b w:val="false"/>
+                <w:bCs w:val="false"/>
+                <w:color w:val="000000"/>
+                <w:sz w:val="18"/>
+                <w:szCs w:val="18"/>
+              </w:rPr>
+              <w:t xml:space="preserve">44.1%</w:t>
+            </w:r>
+          </w:p>
+        </w:tc>
+      </w:tr>
+      <w:tr>
+        <w:tc>
+          <w:tcPr>
+            <w:tcW w:type="dxa" w:w="2900"/>
+            <w:shd w:fill="F5F5F5" w:val="clear"/>
+            <w:tcMar>
+              <w:top w:type="dxa" w:w="60"/>
+              <w:left w:type="dxa" w:w="100"/>
+              <w:bottom w:type="dxa" w:w="60"/>
+              <w:right w:type="dxa" w:w="100"/>
+            </w:tcMar>
+            <w:vAlign w:val="center"/>
+          </w:tcPr>
+          <w:p>
+            <w:pPr>
+              <w:jc w:val="left"/>
+            </w:pPr>
+            <w:r>
+              <w:rPr>
+                <w:b w:val="false"/>
+                <w:bCs w:val="false"/>
+                <w:color w:val="000000"/>
+                <w:sz w:val="18"/>
+                <w:szCs w:val="18"/>
+              </w:rPr>
+              <w:t xml:space="preserve">Koyal Proof Jacket (Men)</w:t>
+            </w:r>
+          </w:p>
+        </w:tc>
+        <w:tc>
+          <w:tcPr>
+            <w:tcW w:type="dxa" w:w="1600"/>
+            <w:shd w:fill="F5F5F5" w:val="clear"/>
+            <w:tcMar>
+              <w:top w:type="dxa" w:w="60"/>
+              <w:left w:type="dxa" w:w="100"/>
+              <w:bottom w:type="dxa" w:w="60"/>
+              <w:right w:type="dxa" w:w="100"/>
+            </w:tcMar>
+            <w:vAlign w:val="center"/>
+          </w:tcPr>
+          <w:p>
+            <w:pPr>
+              <w:jc w:val="center"/>
+            </w:pPr>
+            <w:r>
+              <w:rPr>
+                <w:b w:val="false"/>
+                <w:bCs w:val="false"/>
+                <w:color w:val="000000"/>
+                <w:sz w:val="18"/>
+                <w:szCs w:val="18"/>
+              </w:rPr>
+              <w:t xml:space="preserve">Shell</w:t>
+            </w:r>
+          </w:p>
+        </w:tc>
+        <w:tc>
+          <w:tcPr>
+            <w:tcW w:type="dxa" w:w="1350"/>
+            <w:shd w:fill="F5F5F5" w:val="clear"/>
+            <w:tcMar>
+              <w:top w:type="dxa" w:w="60"/>
+              <w:left w:type="dxa" w:w="100"/>
+              <w:bottom w:type="dxa" w:w="60"/>
+              <w:right w:type="dxa" w:w="100"/>
+            </w:tcMar>
+            <w:vAlign w:val="center"/>
+          </w:tcPr>
+          <w:p>
+            <w:pPr>
+              <w:jc w:val="center"/>
+            </w:pPr>
+            <w:r>
+              <w:rPr>
+                <w:b w:val="false"/>
+                <w:bCs w:val="false"/>
+                <w:color w:val="000000"/>
+                <w:sz w:val="18"/>
+                <w:szCs w:val="18"/>
+              </w:rPr>
+              <w:t xml:space="preserve">1.12M</w:t>
+            </w:r>
+          </w:p>
+        </w:tc>
+        <w:tc>
+          <w:tcPr>
+            <w:tcW w:type="dxa" w:w="1250"/>
+            <w:shd w:fill="F5F5F5" w:val="clear"/>
+            <w:tcMar>
+              <w:top w:type="dxa" w:w="60"/>
+              <w:left w:type="dxa" w:w="100"/>
+              <w:bottom w:type="dxa" w:w="60"/>
+              <w:right w:type="dxa" w:w="100"/>
+            </w:tcMar>
+            <w:vAlign w:val="center"/>
+          </w:tcPr>
+          <w:p>
+            <w:pPr>
+              <w:jc w:val="center"/>
+            </w:pPr>
+            <w:r>
+              <w:rPr>
+                <w:b w:val="false"/>
+                <w:bCs w:val="false"/>
+                <w:color w:val="000000"/>
+                <w:sz w:val="18"/>
+                <w:szCs w:val="18"/>
+              </w:rPr>
+              <w:t xml:space="preserve">-53.5%</w:t>
+            </w:r>
+          </w:p>
+        </w:tc>
+        <w:tc>
+          <w:tcPr>
+            <w:tcW w:type="dxa" w:w="1250"/>
+            <w:shd w:fill="F5F5F5" w:val="clear"/>
+            <w:tcMar>
+              <w:top w:type="dxa" w:w="60"/>
+              <w:left w:type="dxa" w:w="100"/>
+              <w:bottom w:type="dxa" w:w="60"/>
+              <w:right w:type="dxa" w:w="100"/>
+            </w:tcMar>
+            <w:vAlign w:val="center"/>
+          </w:tcPr>
+          <w:p>
+            <w:pPr>
+              <w:jc w:val="center"/>
+            </w:pPr>
+            <w:r>
+              <w:rPr>
+                <w:b w:val="false"/>
+                <w:bCs w:val="false"/>
+                <w:color w:val="000000"/>
+                <w:sz w:val="18"/>
+                <w:szCs w:val="18"/>
+              </w:rPr>
+              <w:t xml:space="preserve">43.4%</w:t>
+            </w:r>
+          </w:p>
+        </w:tc>
+      </w:tr>
+      <w:tr>
+        <w:tc>
+          <w:tcPr>
+            <w:tcW w:type="dxa" w:w="2900"/>
+            <w:tcMar>
+              <w:top w:type="dxa" w:w="60"/>
+              <w:left w:type="dxa" w:w="100"/>
+              <w:bottom w:type="dxa" w:w="60"/>
+              <w:right w:type="dxa" w:w="100"/>
+            </w:tcMar>
+            <w:vAlign w:val="center"/>
+          </w:tcPr>
+          <w:p>
+            <w:pPr>
+              <w:jc w:val="left"/>
+            </w:pPr>
+            <w:r>
+              <w:rPr>
+                <w:b w:val="false"/>
+                <w:bCs w:val="false"/>
+                <w:color w:val="000000"/>
+                <w:sz w:val="18"/>
+                <w:szCs w:val="18"/>
+              </w:rPr>
+              <w:t xml:space="preserve">Chaos GTX Pant (Women)</w:t>
+            </w:r>
+          </w:p>
+        </w:tc>
+        <w:tc>
+          <w:tcPr>
+            <w:tcW w:type="dxa" w:w="1600"/>
+            <w:tcMar>
+              <w:top w:type="dxa" w:w="60"/>
+              <w:left w:type="dxa" w:w="100"/>
+              <w:bottom w:type="dxa" w:w="60"/>
+              <w:right w:type="dxa" w:w="100"/>
+            </w:tcMar>
+            <w:vAlign w:val="center"/>
+          </w:tcPr>
+          <w:p>
+            <w:pPr>
+              <w:jc w:val="center"/>
+            </w:pPr>
+            <w:r>
+              <w:rPr>
+                <w:b w:val="false"/>
+                <w:bCs w:val="false"/>
+                <w:color w:val="000000"/>
+                <w:sz w:val="18"/>
+                <w:szCs w:val="18"/>
+              </w:rPr>
+              <w:t xml:space="preserve">Shell</w:t>
+            </w:r>
+          </w:p>
+        </w:tc>
+        <w:tc>
+          <w:tcPr>
+            <w:tcW w:type="dxa" w:w="1350"/>
+            <w:tcMar>
+              <w:top w:type="dxa" w:w="60"/>
+              <w:left w:type="dxa" w:w="100"/>
+              <w:bottom w:type="dxa" w:w="60"/>
+              <w:right w:type="dxa" w:w="100"/>
+            </w:tcMar>
+            <w:vAlign w:val="center"/>
+          </w:tcPr>
+          <w:p>
+            <w:pPr>
+              <w:jc w:val="center"/>
+            </w:pPr>
+            <w:r>
+              <w:rPr>
+                <w:b w:val="false"/>
+                <w:bCs w:val="false"/>
+                <w:color w:val="000000"/>
+                <w:sz w:val="18"/>
+                <w:szCs w:val="18"/>
+              </w:rPr>
+              <w:t xml:space="preserve">1.11M</w:t>
+            </w:r>
+          </w:p>
+        </w:tc>
+        <w:tc>
+          <w:tcPr>
+            <w:tcW w:type="dxa" w:w="1250"/>
+            <w:tcMar>
+              <w:top w:type="dxa" w:w="60"/>
+              <w:left w:type="dxa" w:w="100"/>
+              <w:bottom w:type="dxa" w:w="60"/>
+              <w:right w:type="dxa" w:w="100"/>
+            </w:tcMar>
+            <w:vAlign w:val="center"/>
+          </w:tcPr>
+          <w:p>
+            <w:pPr>
+              <w:jc w:val="center"/>
+            </w:pPr>
+            <w:r>
+              <w:rPr>
+                <w:b w:val="false"/>
+                <w:bCs w:val="false"/>
+                <w:color w:val="000000"/>
+                <w:sz w:val="18"/>
+                <w:szCs w:val="18"/>
+              </w:rPr>
+              <w:t xml:space="preserve">-26.2%</w:t>
+            </w:r>
+          </w:p>
+        </w:tc>
+        <w:tc>
+          <w:tcPr>
+            <w:tcW w:type="dxa" w:w="1250"/>
+            <w:tcMar>
+              <w:top w:type="dxa" w:w="60"/>
+              <w:left w:type="dxa" w:w="100"/>
+              <w:bottom w:type="dxa" w:w="60"/>
+              <w:right w:type="dxa" w:w="100"/>
+            </w:tcMar>
+            <w:vAlign w:val="center"/>
+          </w:tcPr>
+          <w:p>
+            <w:pPr>
+              <w:jc w:val="center"/>
+            </w:pPr>
+            <w:r>
+              <w:rPr>
+                <w:b w:val="false"/>
+                <w:bCs w:val="false"/>
+                <w:color w:val="000000"/>
+                <w:sz w:val="18"/>
+                <w:szCs w:val="18"/>
+              </w:rPr>
+              <w:t xml:space="preserve">51.0%</w:t>
+            </w:r>
+          </w:p>
+        </w:tc>
+      </w:tr>
+      <w:tr>
+        <w:tc>
+          <w:tcPr>
+            <w:tcW w:type="dxa" w:w="2900"/>
+            <w:shd w:fill="F5F5F5" w:val="clear"/>
+            <w:tcMar>
+              <w:top w:type="dxa" w:w="60"/>
+              <w:left w:type="dxa" w:w="100"/>
+              <w:bottom w:type="dxa" w:w="60"/>
+              <w:right w:type="dxa" w:w="100"/>
+            </w:tcMar>
+            <w:vAlign w:val="center"/>
+          </w:tcPr>
+          <w:p>
+            <w:pPr>
+              <w:jc w:val="left"/>
+            </w:pPr>
+            <w:r>
+              <w:rPr>
+                <w:b w:val="false"/>
+                <w:bCs w:val="false"/>
+                <w:color w:val="000000"/>
+                <w:sz w:val="18"/>
+                <w:szCs w:val="18"/>
+              </w:rPr>
+              <w:t xml:space="preserve">Risberg Jacket (Women)</w:t>
+            </w:r>
+          </w:p>
+        </w:tc>
+        <w:tc>
+          <w:tcPr>
+            <w:tcW w:type="dxa" w:w="1600"/>
+            <w:shd w:fill="F5F5F5" w:val="clear"/>
+            <w:tcMar>
+              <w:top w:type="dxa" w:w="60"/>
+              <w:left w:type="dxa" w:w="100"/>
+              <w:bottom w:type="dxa" w:w="60"/>
+              <w:right w:type="dxa" w:w="100"/>
+            </w:tcMar>
+            <w:vAlign w:val="center"/>
+          </w:tcPr>
+          <w:p>
+            <w:pPr>
+              <w:jc w:val="center"/>
+            </w:pPr>
+            <w:r>
+              <w:rPr>
+                <w:b w:val="false"/>
+                <w:bCs w:val="false"/>
+                <w:color w:val="000000"/>
+                <w:sz w:val="18"/>
+                <w:szCs w:val="18"/>
+              </w:rPr>
+              <w:t xml:space="preserve">Mid layer</w:t>
+            </w:r>
+          </w:p>
+        </w:tc>
+        <w:tc>
+          <w:tcPr>
+            <w:tcW w:type="dxa" w:w="1350"/>
+            <w:shd w:fill="F5F5F5" w:val="clear"/>
+            <w:tcMar>
+              <w:top w:type="dxa" w:w="60"/>
+              <w:left w:type="dxa" w:w="100"/>
+              <w:bottom w:type="dxa" w:w="60"/>
+              <w:right w:type="dxa" w:w="100"/>
+            </w:tcMar>
+            <w:vAlign w:val="center"/>
+          </w:tcPr>
+          <w:p>
+            <w:pPr>
+              <w:jc w:val="center"/>
+            </w:pPr>
+            <w:r>
+              <w:rPr>
+                <w:b w:val="false"/>
+                <w:bCs w:val="false"/>
+                <w:color w:val="000000"/>
+                <w:sz w:val="18"/>
+                <w:szCs w:val="18"/>
+              </w:rPr>
+              <w:t xml:space="preserve">1.05M</w:t>
+            </w:r>
+          </w:p>
+        </w:tc>
+        <w:tc>
+          <w:tcPr>
+            <w:tcW w:type="dxa" w:w="1250"/>
+            <w:shd w:fill="F5F5F5" w:val="clear"/>
+            <w:tcMar>
+              <w:top w:type="dxa" w:w="60"/>
+              <w:left w:type="dxa" w:w="100"/>
+              <w:bottom w:type="dxa" w:w="60"/>
+              <w:right w:type="dxa" w:w="100"/>
+            </w:tcMar>
+            <w:vAlign w:val="center"/>
+          </w:tcPr>
+          <w:p>
+            <w:pPr>
+              <w:jc w:val="center"/>
+            </w:pPr>
+            <w:r>
+              <w:rPr>
+                <w:b w:val="false"/>
+                <w:bCs w:val="false"/>
+                <w:color w:val="000000"/>
+                <w:sz w:val="18"/>
+                <w:szCs w:val="18"/>
+              </w:rPr>
+              <w:t xml:space="preserve">-43.1%</w:t>
+            </w:r>
+          </w:p>
+        </w:tc>
+        <w:tc>
+          <w:tcPr>
+            <w:tcW w:type="dxa" w:w="1250"/>
+            <w:shd w:fill="F5F5F5" w:val="clear"/>
+            <w:tcMar>
+              <w:top w:type="dxa" w:w="60"/>
+              <w:left w:type="dxa" w:w="100"/>
+              <w:bottom w:type="dxa" w:w="60"/>
+              <w:right w:type="dxa" w:w="100"/>
+            </w:tcMar>
+            <w:vAlign w:val="center"/>
+          </w:tcPr>
+          <w:p>
+            <w:pPr>
+              <w:jc w:val="center"/>
+            </w:pPr>
+            <w:r>
+              <w:rPr>
+                <w:b w:val="false"/>
+                <w:bCs w:val="false"/>
+                <w:color w:val="000000"/>
+                <w:sz w:val="18"/>
+                <w:szCs w:val="18"/>
+              </w:rPr>
+              <w:t xml:space="preserve">53.0%</w:t>
+            </w:r>
+          </w:p>
+        </w:tc>
+      </w:tr>
+      <w:tr>
+        <w:tc>
+          <w:tcPr>
+            <w:tcW w:type="dxa" w:w="2900"/>
+            <w:tcMar>
+              <w:top w:type="dxa" w:w="60"/>
+              <w:left w:type="dxa" w:w="100"/>
+              <w:bottom w:type="dxa" w:w="60"/>
+              <w:right w:type="dxa" w:w="100"/>
+            </w:tcMar>
+            <w:vAlign w:val="center"/>
+          </w:tcPr>
+          <w:p>
+            <w:pPr>
+              <w:jc w:val="left"/>
+            </w:pPr>
+            <w:r>
+              <w:rPr>
+                <w:b w:val="false"/>
+                <w:bCs w:val="false"/>
+                <w:color w:val="000000"/>
+                <w:sz w:val="18"/>
+                <w:szCs w:val="18"/>
+              </w:rPr>
+              <w:t xml:space="preserve">Koyal Proof Jacket (Women)</w:t>
+            </w:r>
+          </w:p>
+        </w:tc>
+        <w:tc>
+          <w:tcPr>
+            <w:tcW w:type="dxa" w:w="1600"/>
+            <w:tcMar>
+              <w:top w:type="dxa" w:w="60"/>
+              <w:left w:type="dxa" w:w="100"/>
+              <w:bottom w:type="dxa" w:w="60"/>
+              <w:right w:type="dxa" w:w="100"/>
+            </w:tcMar>
+            <w:vAlign w:val="center"/>
+          </w:tcPr>
+          <w:p>
+            <w:pPr>
+              <w:jc w:val="center"/>
+            </w:pPr>
+            <w:r>
+              <w:rPr>
+                <w:b w:val="false"/>
+                <w:bCs w:val="false"/>
+                <w:color w:val="000000"/>
+                <w:sz w:val="18"/>
+                <w:szCs w:val="18"/>
+              </w:rPr>
+              <w:t xml:space="preserve">Shell</w:t>
+            </w:r>
+          </w:p>
+        </w:tc>
+        <w:tc>
+          <w:tcPr>
+            <w:tcW w:type="dxa" w:w="1350"/>
+            <w:tcMar>
+              <w:top w:type="dxa" w:w="60"/>
+              <w:left w:type="dxa" w:w="100"/>
+              <w:bottom w:type="dxa" w:w="60"/>
+              <w:right w:type="dxa" w:w="100"/>
+            </w:tcMar>
+            <w:vAlign w:val="center"/>
+          </w:tcPr>
+          <w:p>
+            <w:pPr>
+              <w:jc w:val="center"/>
+            </w:pPr>
+            <w:r>
+              <w:rPr>
+                <w:b w:val="false"/>
+                <w:bCs w:val="false"/>
+                <w:color w:val="000000"/>
+                <w:sz w:val="18"/>
+                <w:szCs w:val="18"/>
+              </w:rPr>
+              <w:t xml:space="preserve">1.00M</w:t>
+            </w:r>
+          </w:p>
+        </w:tc>
+        <w:tc>
+          <w:tcPr>
+            <w:tcW w:type="dxa" w:w="1250"/>
+            <w:tcMar>
+              <w:top w:type="dxa" w:w="60"/>
+              <w:left w:type="dxa" w:w="100"/>
+              <w:bottom w:type="dxa" w:w="60"/>
+              <w:right w:type="dxa" w:w="100"/>
+            </w:tcMar>
+            <w:vAlign w:val="center"/>
+          </w:tcPr>
+          <w:p>
+            <w:pPr>
+              <w:jc w:val="center"/>
+            </w:pPr>
+            <w:r>
+              <w:rPr>
+                <w:b w:val="false"/>
+                <w:bCs w:val="false"/>
+                <w:color w:val="000000"/>
+                <w:sz w:val="18"/>
+                <w:szCs w:val="18"/>
+              </w:rPr>
+              <w:t xml:space="preserve">-49.3%</w:t>
+            </w:r>
+          </w:p>
+        </w:tc>
+        <w:tc>
+          <w:tcPr>
+            <w:tcW w:type="dxa" w:w="1250"/>
+            <w:tcMar>
+              <w:top w:type="dxa" w:w="60"/>
+              <w:left w:type="dxa" w:w="100"/>
+              <w:bottom w:type="dxa" w:w="60"/>
+              <w:right w:type="dxa" w:w="100"/>
+            </w:tcMar>
+            <w:vAlign w:val="center"/>
+          </w:tcPr>
+          <w:p>
+            <w:pPr>
+              <w:jc w:val="center"/>
+            </w:pPr>
+            <w:r>
+              <w:rPr>
+                <w:b w:val="false"/>
+                <w:bCs w:val="false"/>
+                <w:color w:val="000000"/>
+                <w:sz w:val="18"/>
+                <w:szCs w:val="18"/>
+              </w:rPr>
+              <w:t xml:space="preserve">47.6%</w:t>
+            </w:r>
+          </w:p>
+        </w:tc>
+      </w:tr>
+      <w:tr>
+        <w:tc>
+          <w:tcPr>
+            <w:tcW w:type="dxa" w:w="2900"/>
+            <w:shd w:fill="F5F5F5" w:val="clear"/>
+            <w:tcMar>
+              <w:top w:type="dxa" w:w="60"/>
+              <w:left w:type="dxa" w:w="100"/>
+              <w:bottom w:type="dxa" w:w="60"/>
+              <w:right w:type="dxa" w:w="100"/>
+            </w:tcMar>
+            <w:vAlign w:val="center"/>
+          </w:tcPr>
+          <w:p>
+            <w:pPr>
+              <w:jc w:val="left"/>
+            </w:pPr>
+            <w:r>
+              <w:rPr>
+                <w:b w:val="false"/>
+                <w:bCs w:val="false"/>
+                <w:color w:val="000000"/>
+                <w:sz w:val="18"/>
+                <w:szCs w:val="18"/>
+              </w:rPr>
+              <w:t xml:space="preserve">Malung Pile Hood (Women)</w:t>
+            </w:r>
+          </w:p>
+        </w:tc>
+        <w:tc>
+          <w:tcPr>
+            <w:tcW w:type="dxa" w:w="1600"/>
+            <w:shd w:fill="F5F5F5" w:val="clear"/>
+            <w:tcMar>
+              <w:top w:type="dxa" w:w="60"/>
+              <w:left w:type="dxa" w:w="100"/>
+              <w:bottom w:type="dxa" w:w="60"/>
+              <w:right w:type="dxa" w:w="100"/>
+            </w:tcMar>
+            <w:vAlign w:val="center"/>
+          </w:tcPr>
+          <w:p>
+            <w:pPr>
+              <w:jc w:val="center"/>
+            </w:pPr>
+            <w:r>
+              <w:rPr>
+                <w:b w:val="false"/>
+                <w:bCs w:val="false"/>
+                <w:color w:val="000000"/>
+                <w:sz w:val="18"/>
+                <w:szCs w:val="18"/>
+              </w:rPr>
+              <w:t xml:space="preserve">Mid layer</w:t>
+            </w:r>
+          </w:p>
+        </w:tc>
+        <w:tc>
+          <w:tcPr>
+            <w:tcW w:type="dxa" w:w="1350"/>
+            <w:shd w:fill="F5F5F5" w:val="clear"/>
+            <w:tcMar>
+              <w:top w:type="dxa" w:w="60"/>
+              <w:left w:type="dxa" w:w="100"/>
+              <w:bottom w:type="dxa" w:w="60"/>
+              <w:right w:type="dxa" w:w="100"/>
+            </w:tcMar>
+            <w:vAlign w:val="center"/>
+          </w:tcPr>
+          <w:p>
+            <w:pPr>
+              <w:jc w:val="center"/>
+            </w:pPr>
+            <w:r>
+              <w:rPr>
+                <w:b w:val="false"/>
+                <w:bCs w:val="false"/>
+                <w:color w:val="000000"/>
+                <w:sz w:val="18"/>
+                <w:szCs w:val="18"/>
+              </w:rPr>
+              <w:t xml:space="preserve">0.95M</w:t>
+            </w:r>
+          </w:p>
+        </w:tc>
+        <w:tc>
+          <w:tcPr>
+            <w:tcW w:type="dxa" w:w="1250"/>
+            <w:shd w:fill="F5F5F5" w:val="clear"/>
+            <w:tcMar>
+              <w:top w:type="dxa" w:w="60"/>
+              <w:left w:type="dxa" w:w="100"/>
+              <w:bottom w:type="dxa" w:w="60"/>
+              <w:right w:type="dxa" w:w="100"/>
+            </w:tcMar>
+            <w:vAlign w:val="center"/>
+          </w:tcPr>
+          <w:p>
+            <w:pPr>
+              <w:jc w:val="center"/>
+            </w:pPr>
+            <w:r>
+              <w:rPr>
+                <w:b w:val="false"/>
+                <w:bCs w:val="false"/>
+                <w:color w:val="000000"/>
+                <w:sz w:val="18"/>
+                <w:szCs w:val="18"/>
+              </w:rPr>
+              <w:t xml:space="preserve">-31.6%</w:t>
+            </w:r>
+          </w:p>
+        </w:tc>
+        <w:tc>
+          <w:tcPr>
+            <w:tcW w:type="dxa" w:w="1250"/>
+            <w:shd w:fill="F5F5F5" w:val="clear"/>
+            <w:tcMar>
+              <w:top w:type="dxa" w:w="60"/>
+              <w:left w:type="dxa" w:w="100"/>
+              <w:bottom w:type="dxa" w:w="60"/>
+              <w:right w:type="dxa" w:w="100"/>
+            </w:tcMar>
+            <w:vAlign w:val="center"/>
+          </w:tcPr>
+          <w:p>
+            <w:pPr>
+              <w:jc w:val="center"/>
+            </w:pPr>
+            <w:r>
+              <w:rPr>
+                <w:b w:val="false"/>
+                <w:bCs w:val="false"/>
+                <w:color w:val="000000"/>
+                <w:sz w:val="18"/>
+                <w:szCs w:val="18"/>
+              </w:rPr>
+              <w:t xml:space="preserve">49.4%</w:t>
+            </w:r>
+          </w:p>
+        </w:tc>
+      </w:tr>
+      <w:tr>
+        <w:tc>
+          <w:tcPr>
+            <w:tcW w:type="dxa" w:w="2900"/>
+            <w:tcMar>
+              <w:top w:type="dxa" w:w="60"/>
+              <w:left w:type="dxa" w:w="100"/>
+              <w:bottom w:type="dxa" w:w="60"/>
+              <w:right w:type="dxa" w:w="100"/>
+            </w:tcMar>
+            <w:vAlign w:val="center"/>
+          </w:tcPr>
+          <w:p>
+            <w:pPr>
+              <w:jc w:val="left"/>
+            </w:pPr>
+            <w:r>
+              <w:rPr>
+                <w:b w:val="false"/>
+                <w:bCs w:val="false"/>
+                <w:color w:val="000000"/>
+                <w:sz w:val="18"/>
+                <w:szCs w:val="18"/>
+              </w:rPr>
+              <w:t xml:space="preserve">Finch Proof Jacket (Men)</w:t>
+            </w:r>
+          </w:p>
+        </w:tc>
+        <w:tc>
+          <w:tcPr>
+            <w:tcW w:type="dxa" w:w="1600"/>
+            <w:tcMar>
+              <w:top w:type="dxa" w:w="60"/>
+              <w:left w:type="dxa" w:w="100"/>
+              <w:bottom w:type="dxa" w:w="60"/>
+              <w:right w:type="dxa" w:w="100"/>
+            </w:tcMar>
+            <w:vAlign w:val="center"/>
+          </w:tcPr>
+          <w:p>
+            <w:pPr>
+              <w:jc w:val="center"/>
+            </w:pPr>
+            <w:r>
+              <w:rPr>
+                <w:b w:val="false"/>
+                <w:bCs w:val="false"/>
+                <w:color w:val="000000"/>
+                <w:sz w:val="18"/>
+                <w:szCs w:val="18"/>
+              </w:rPr>
+              <w:t xml:space="preserve">Shell</w:t>
+            </w:r>
+          </w:p>
+        </w:tc>
+        <w:tc>
+          <w:tcPr>
+            <w:tcW w:type="dxa" w:w="1350"/>
+            <w:tcMar>
+              <w:top w:type="dxa" w:w="60"/>
+              <w:left w:type="dxa" w:w="100"/>
+              <w:bottom w:type="dxa" w:w="60"/>
+              <w:right w:type="dxa" w:w="100"/>
+            </w:tcMar>
+            <w:vAlign w:val="center"/>
+          </w:tcPr>
+          <w:p>
+            <w:pPr>
+              <w:jc w:val="center"/>
+            </w:pPr>
+            <w:r>
+              <w:rPr>
+                <w:b w:val="false"/>
+                <w:bCs w:val="false"/>
+                <w:color w:val="000000"/>
+                <w:sz w:val="18"/>
+                <w:szCs w:val="18"/>
+              </w:rPr>
+              <w:t xml:space="preserve">0.92M</w:t>
+            </w:r>
+          </w:p>
+        </w:tc>
+        <w:tc>
+          <w:tcPr>
+            <w:tcW w:type="dxa" w:w="1250"/>
+            <w:tcMar>
+              <w:top w:type="dxa" w:w="60"/>
+              <w:left w:type="dxa" w:w="100"/>
+              <w:bottom w:type="dxa" w:w="60"/>
+              <w:right w:type="dxa" w:w="100"/>
+            </w:tcMar>
+            <w:vAlign w:val="center"/>
+          </w:tcPr>
+          <w:p>
+            <w:pPr>
+              <w:jc w:val="center"/>
+            </w:pPr>
+            <w:r>
+              <w:rPr>
+                <w:b w:val="false"/>
+                <w:bCs w:val="false"/>
+                <w:color w:val="000000"/>
+                <w:sz w:val="18"/>
+                <w:szCs w:val="18"/>
+              </w:rPr>
+              <w:t xml:space="preserve">-18.6%</w:t>
+            </w:r>
+          </w:p>
+        </w:tc>
+        <w:tc>
+          <w:tcPr>
+            <w:tcW w:type="dxa" w:w="1250"/>
+            <w:tcMar>
+              <w:top w:type="dxa" w:w="60"/>
+              <w:left w:type="dxa" w:w="100"/>
+              <w:bottom w:type="dxa" w:w="60"/>
+              <w:right w:type="dxa" w:w="100"/>
+            </w:tcMar>
+            <w:vAlign w:val="center"/>
+          </w:tcPr>
+          <w:p>
+            <w:pPr>
+              <w:jc w:val="center"/>
+            </w:pPr>
+            <w:r>
+              <w:rPr>
+                <w:b w:val="false"/>
+                <w:bCs w:val="false"/>
+                <w:color w:val="000000"/>
+                <w:sz w:val="18"/>
+                <w:szCs w:val="18"/>
+              </w:rPr>
+              <w:t xml:space="preserve">51.8%</w:t>
+            </w:r>
+          </w:p>
+        </w:tc>
+      </w:tr>
+      <w:tr>
+        <w:tc>
+          <w:tcPr>
+            <w:tcW w:type="dxa" w:w="2900"/>
+            <w:shd w:fill="F5F5F5" w:val="clear"/>
+            <w:tcMar>
+              <w:top w:type="dxa" w:w="60"/>
+              <w:left w:type="dxa" w:w="100"/>
+              <w:bottom w:type="dxa" w:w="60"/>
+              <w:right w:type="dxa" w:w="100"/>
+            </w:tcMar>
+            <w:vAlign w:val="center"/>
+          </w:tcPr>
+          <w:p>
+            <w:pPr>
+              <w:jc w:val="left"/>
+            </w:pPr>
+            <w:r>
+              <w:rPr>
+                <w:b w:val="false"/>
+                <w:bCs w:val="false"/>
+                <w:color w:val="000000"/>
+                <w:sz w:val="18"/>
+                <w:szCs w:val="18"/>
+              </w:rPr>
+              <w:t xml:space="preserve">Mila Jacket (Unisex)</w:t>
+            </w:r>
+          </w:p>
+        </w:tc>
+        <w:tc>
+          <w:tcPr>
+            <w:tcW w:type="dxa" w:w="1600"/>
+            <w:shd w:fill="F5F5F5" w:val="clear"/>
+            <w:tcMar>
+              <w:top w:type="dxa" w:w="60"/>
+              <w:left w:type="dxa" w:w="100"/>
+              <w:bottom w:type="dxa" w:w="60"/>
+              <w:right w:type="dxa" w:w="100"/>
+            </w:tcMar>
+            <w:vAlign w:val="center"/>
+          </w:tcPr>
+          <w:p>
+            <w:pPr>
+              <w:jc w:val="center"/>
+            </w:pPr>
+            <w:r>
+              <w:rPr>
+                <w:b w:val="false"/>
+                <w:bCs w:val="false"/>
+                <w:color w:val="000000"/>
+                <w:sz w:val="18"/>
+                <w:szCs w:val="18"/>
+              </w:rPr>
+              <w:t xml:space="preserve">Shell</w:t>
+            </w:r>
+          </w:p>
+        </w:tc>
+        <w:tc>
+          <w:tcPr>
+            <w:tcW w:type="dxa" w:w="1350"/>
+            <w:shd w:fill="F5F5F5" w:val="clear"/>
+            <w:tcMar>
+              <w:top w:type="dxa" w:w="60"/>
+              <w:left w:type="dxa" w:w="100"/>
+              <w:bottom w:type="dxa" w:w="60"/>
+              <w:right w:type="dxa" w:w="100"/>
+            </w:tcMar>
+            <w:vAlign w:val="center"/>
+          </w:tcPr>
+          <w:p>
+            <w:pPr>
+              <w:jc w:val="center"/>
+            </w:pPr>
+            <w:r>
+              <w:rPr>
+                <w:b w:val="false"/>
+                <w:bCs w:val="false"/>
+                <w:color w:val="000000"/>
+                <w:sz w:val="18"/>
+                <w:szCs w:val="18"/>
+              </w:rPr>
+              <w:t xml:space="preserve">0.86M</w:t>
+            </w:r>
+          </w:p>
+        </w:tc>
+        <w:tc>
+          <w:tcPr>
+            <w:tcW w:type="dxa" w:w="1250"/>
+            <w:shd w:fill="F5F5F5" w:val="clear"/>
+            <w:tcMar>
+              <w:top w:type="dxa" w:w="60"/>
+              <w:left w:type="dxa" w:w="100"/>
+              <w:bottom w:type="dxa" w:w="60"/>
+              <w:right w:type="dxa" w:w="100"/>
+            </w:tcMar>
+            <w:vAlign w:val="center"/>
+          </w:tcPr>
+          <w:p>
+            <w:pPr>
+              <w:jc w:val="center"/>
+            </w:pPr>
+            <w:r>
+              <w:rPr>
+                <w:b w:val="false"/>
+                <w:bCs w:val="false"/>
+                <w:color w:val="000000"/>
+                <w:sz w:val="18"/>
+                <w:szCs w:val="18"/>
+              </w:rPr>
+              <w:t xml:space="preserve">-21.7%</w:t>
+            </w:r>
+          </w:p>
+        </w:tc>
+        <w:tc>
+          <w:tcPr>
+            <w:tcW w:type="dxa" w:w="1250"/>
+            <w:shd w:fill="F5F5F5" w:val="clear"/>
+            <w:tcMar>
+              <w:top w:type="dxa" w:w="60"/>
+              <w:left w:type="dxa" w:w="100"/>
+              <w:bottom w:type="dxa" w:w="60"/>
+              <w:right w:type="dxa" w:w="100"/>
+            </w:tcMar>
+            <w:vAlign w:val="center"/>
+          </w:tcPr>
+          <w:p>
+            <w:pPr>
+              <w:jc w:val="center"/>
+            </w:pPr>
+            <w:r>
+              <w:rPr>
+                <w:b w:val="false"/>
+                <w:bCs w:val="false"/>
+                <w:color w:val="000000"/>
+                <w:sz w:val="18"/>
+                <w:szCs w:val="18"/>
+              </w:rPr>
+              <w:t xml:space="preserve">45.3%</w:t>
+            </w:r>
+          </w:p>
+        </w:tc>
+      </w:tr>
+    </w:tbl>
+    <w:p>
+      <w:pPr>
+        <w:spacing w:after="200"/>
+      </w:pPr>
+      <w:r>
+        <w:rPr>
+          <w:i/>
+          <w:iCs/>
+          <w:color w:val="555555"/>
+          <w:sz w:val="18"/>
+          <w:szCs w:val="18"/>
+        </w:rPr>
+        <w:t xml:space="preserve">Full 236-franchise list (all four statuses: Core FW27, SS27/28 confirmed, SS27/28 possible, Not found) is in the backup workbook (bob_item3_portfolio_backup.xlsx, sheet 'Harvest - FW27 Check'). The 44 'possible match' franchises needing a Product/Merchandising call are in the separate review file (FW27_Possible_Match_Review.xlsx, filtered to Tier = Harvest).</w:t>
+      </w:r>
+    </w:p>
     <w:p>
       <w:pPr>
         <w:pStyle w:val="Heading3"/>

</xml_diff>